<commit_message>
Fixed: Use config file TableStyleName (BT-Default) instead of hardcoded default (Light Grid Accent 1)
</commit_message>
<xml_diff>
--- a/output/assessments/MyAssessment.docx
+++ b/output/assessments/MyAssessment.docx
@@ -7866,12 +7866,170 @@
     </w:p>
     <w:p>
       <w:pPr>
+        <w:pStyle w:val="Caption"/>
         <w:rPr>
           <w:lang w:val="en-US"/>
         </w:rPr>
       </w:pPr>
       <w:bookmarkStart w:id="23" w:name="BK_Domain_Discovery_Table"/>
       <w:bookmarkEnd w:id="23"/>
+      <w:r>
+        <w:rPr>
+          <w:lang w:val="en-US"/>
+        </w:rPr>
+        <w:t>Domain Discovery Summary</w:t>
+      </w:r>
+    </w:p>
+    <w:tbl>
+      <w:tblPr>
+        <w:tblW w:w="0" w:type="auto"/>
+        <w:tblLook w:val="0000" w:firstRow="0" w:lastRow="0" w:firstColumn="0" w:lastColumn="0" w:noHBand="0" w:noVBand="0"/>
+      </w:tblPr>
+      <w:tblGrid>
+        <w:gridCol w:w="3120"/>
+        <w:gridCol w:w="3120"/>
+        <w:gridCol w:w="3120"/>
+      </w:tblGrid>
+      <w:tr>
+        <w:tblPrEx>
+          <w:tblCellMar>
+            <w:top w:w="0" w:type="dxa"/>
+            <w:bottom w:w="0" w:type="dxa"/>
+          </w:tblCellMar>
+        </w:tblPrEx>
+        <w:trPr>
+          <w:tblHeader/>
+        </w:trPr>
+        <w:tc>
+          <w:tcPr>
+            <w:tcW w:w="0" w:type="auto"/>
+          </w:tcPr>
+          <w:p>
+            <w:pPr>
+              <w:rPr>
+                <w:color w:val="FFFFFF"/>
+                <w:lang w:val="en-US"/>
+              </w:rPr>
+            </w:pPr>
+            <w:r>
+              <w:rPr>
+                <w:color w:val="FFFFFF"/>
+                <w:lang w:val="en-US"/>
+              </w:rPr>
+              <w:t>PDC Emulator</w:t>
+            </w:r>
+          </w:p>
+        </w:tc>
+        <w:tc>
+          <w:tcPr>
+            <w:tcW w:w="0" w:type="auto"/>
+          </w:tcPr>
+          <w:p>
+            <w:pPr>
+              <w:rPr>
+                <w:color w:val="FFFFFF"/>
+                <w:lang w:val="en-US"/>
+              </w:rPr>
+            </w:pPr>
+            <w:r>
+              <w:rPr>
+                <w:color w:val="FFFFFF"/>
+                <w:lang w:val="en-US"/>
+              </w:rPr>
+              <w:t>RID Master</w:t>
+            </w:r>
+          </w:p>
+        </w:tc>
+        <w:tc>
+          <w:tcPr>
+            <w:tcW w:w="0" w:type="auto"/>
+          </w:tcPr>
+          <w:p>
+            <w:pPr>
+              <w:rPr>
+                <w:color w:val="FFFFFF"/>
+                <w:lang w:val="en-US"/>
+              </w:rPr>
+            </w:pPr>
+            <w:r>
+              <w:rPr>
+                <w:color w:val="FFFFFF"/>
+                <w:lang w:val="en-US"/>
+              </w:rPr>
+              <w:t>Infrastructure Master</w:t>
+            </w:r>
+          </w:p>
+        </w:tc>
+      </w:tr>
+      <w:tr>
+        <w:tblPrEx>
+          <w:tblCellMar>
+            <w:top w:w="0" w:type="dxa"/>
+            <w:bottom w:w="0" w:type="dxa"/>
+          </w:tblCellMar>
+        </w:tblPrEx>
+        <w:tc>
+          <w:tcPr>
+            <w:tcW w:w="0" w:type="auto"/>
+          </w:tcPr>
+          <w:p>
+            <w:pPr>
+              <w:rPr>
+                <w:lang w:val="en-US"/>
+              </w:rPr>
+            </w:pPr>
+            <w:r>
+              <w:rPr>
+                <w:lang w:val="en-US"/>
+              </w:rPr>
+              <w:t>LONROGDC05.corp.voyageurtransportation.ca</w:t>
+            </w:r>
+          </w:p>
+        </w:tc>
+        <w:tc>
+          <w:tcPr>
+            <w:tcW w:w="0" w:type="auto"/>
+          </w:tcPr>
+          <w:p>
+            <w:pPr>
+              <w:rPr>
+                <w:lang w:val="en-US"/>
+              </w:rPr>
+            </w:pPr>
+            <w:r>
+              <w:rPr>
+                <w:lang w:val="en-US"/>
+              </w:rPr>
+              <w:t>LONROGDC05.corp.voyageurtransportation.ca</w:t>
+            </w:r>
+          </w:p>
+        </w:tc>
+        <w:tc>
+          <w:tcPr>
+            <w:tcW w:w="0" w:type="auto"/>
+          </w:tcPr>
+          <w:p>
+            <w:pPr>
+              <w:rPr>
+                <w:lang w:val="en-US"/>
+              </w:rPr>
+            </w:pPr>
+            <w:r>
+              <w:rPr>
+                <w:lang w:val="en-US"/>
+              </w:rPr>
+              <w:t>LONROGDC05.corp.voyageurtransportation.ca</w:t>
+            </w:r>
+          </w:p>
+        </w:tc>
+      </w:tr>
+    </w:tbl>
+    <w:p>
+      <w:pPr>
+        <w:rPr>
+          <w:lang w:val="en-US"/>
+        </w:rPr>
+      </w:pPr>
     </w:p>
     <w:p>
       <w:pPr>
@@ -10651,37 +10809,51 @@
               <w:rPr>
                 <w:lang w:val="en-US"/>
               </w:rPr>
-              <w:t>CN=London970CoLo,CN=Sites,CN=Configuration,DC=corp,DC=voyageurtransportation,DC=ca</w:t>
-            </w:r>
-          </w:p>
-        </w:tc>
-        <w:tc>
-          <w:tcPr>
-            <w:tcW w:w="1872" w:type="dxa"/>
-          </w:tcPr>
-          <w:p>
-            <w:pPr>
-              <w:rPr>
-                <w:lang w:val="en-US"/>
-              </w:rPr>
-            </w:pPr>
-          </w:p>
-        </w:tc>
-        <w:tc>
-          <w:tcPr>
-            <w:tcW w:w="1872" w:type="dxa"/>
-          </w:tcPr>
-          <w:p>
-            <w:pPr>
-              <w:rPr>
-                <w:lang w:val="en-US"/>
-              </w:rPr>
-            </w:pPr>
-            <w:r>
-              <w:rPr>
-                <w:lang w:val="en-US"/>
-              </w:rPr>
-              <w:t>CN=10.40.74.0/24,CN=Subnets,CN=Sites,CN=Configuration,DC=corp,DC=voyageurtransportation,DC=ca</w:t>
+              <w:t>CN=London970CoLo,CN=Sites,CN=Configuration,DC=corp,DC=voyage</w:t>
+            </w:r>
+            <w:r>
+              <w:rPr>
+                <w:lang w:val="en-US"/>
+              </w:rPr>
+              <w:lastRenderedPageBreak/>
+              <w:t>urtransportation,DC=ca</w:t>
+            </w:r>
+          </w:p>
+        </w:tc>
+        <w:tc>
+          <w:tcPr>
+            <w:tcW w:w="1872" w:type="dxa"/>
+          </w:tcPr>
+          <w:p>
+            <w:pPr>
+              <w:rPr>
+                <w:lang w:val="en-US"/>
+              </w:rPr>
+            </w:pPr>
+          </w:p>
+        </w:tc>
+        <w:tc>
+          <w:tcPr>
+            <w:tcW w:w="1872" w:type="dxa"/>
+          </w:tcPr>
+          <w:p>
+            <w:pPr>
+              <w:rPr>
+                <w:lang w:val="en-US"/>
+              </w:rPr>
+            </w:pPr>
+            <w:r>
+              <w:rPr>
+                <w:lang w:val="en-US"/>
+              </w:rPr>
+              <w:t>CN=10.40.74.0/24,CN=Subnets,CN=Sites,CN=Configuration,DC=corp,</w:t>
+            </w:r>
+            <w:r>
+              <w:rPr>
+                <w:lang w:val="en-US"/>
+              </w:rPr>
+              <w:lastRenderedPageBreak/>
+              <w:t>DC=voyageurtransportation,DC=ca</w:t>
             </w:r>
           </w:p>
         </w:tc>
@@ -11785,6 +11957,7 @@
               <w:rPr>
                 <w:lang w:val="en-US"/>
               </w:rPr>
+              <w:lastRenderedPageBreak/>
               <w:t>LONROGDC04.corp.voyageurtransportation.ca</w:t>
             </w:r>
           </w:p>
@@ -13205,6 +13378,7 @@
         <w:rPr>
           <w:noProof/>
         </w:rPr>
+        <w:lastRenderedPageBreak/>
         <w:t>Groups</w:t>
       </w:r>
       <w:bookmarkEnd w:id="46"/>
@@ -24375,6 +24549,7 @@
         <w:rPr>
           <w:rStyle w:val="Heading2Char"/>
         </w:rPr>
+        <w:lastRenderedPageBreak/>
         <w:t xml:space="preserve">AD to </w:t>
       </w:r>
       <w:r>
@@ -24980,6 +25155,7 @@
           <w:noProof/>
           <w:szCs w:val="36"/>
         </w:rPr>
+        <w:lastRenderedPageBreak/>
         <w:t>Exchange – Online Assessment</w:t>
       </w:r>
       <w:bookmarkEnd w:id="72"/>

</xml_diff>

<commit_message>
Added .Count property validation to catch metrics access errors early
</commit_message>
<xml_diff>
--- a/output/assessments/MyAssessment.docx
+++ b/output/assessments/MyAssessment.docx
@@ -8291,7 +8291,6 @@
         <w:rPr>
           <w:noProof/>
         </w:rPr>
-        <w:lastRenderedPageBreak/>
         <w:t>Sites, Subnets and Sitelinks</w:t>
       </w:r>
       <w:bookmarkEnd w:id="25"/>
@@ -9203,51 +9202,37 @@
               <w:rPr>
                 <w:lang w:val="en-US"/>
               </w:rPr>
-              <w:t>CN=London970CoLo,CN=Sites,CN=Configuration,DC</w:t>
-            </w:r>
-            <w:r>
-              <w:rPr>
-                <w:lang w:val="en-US"/>
-              </w:rPr>
-              <w:lastRenderedPageBreak/>
-              <w:t>=corp,DC=voyageurtransportation,DC=ca</w:t>
-            </w:r>
-          </w:p>
-        </w:tc>
-        <w:tc>
-          <w:tcPr>
-            <w:tcW w:w="1872" w:type="dxa"/>
-          </w:tcPr>
-          <w:p>
-            <w:pPr>
-              <w:rPr>
-                <w:lang w:val="en-US"/>
-              </w:rPr>
-            </w:pPr>
-          </w:p>
-        </w:tc>
-        <w:tc>
-          <w:tcPr>
-            <w:tcW w:w="1872" w:type="dxa"/>
-          </w:tcPr>
-          <w:p>
-            <w:pPr>
-              <w:rPr>
-                <w:lang w:val="en-US"/>
-              </w:rPr>
-            </w:pPr>
-            <w:r>
-              <w:rPr>
-                <w:lang w:val="en-US"/>
-              </w:rPr>
-              <w:t>CN=10.1.55.0/24,CN=Subnets,CN=Sites,CN=Configu</w:t>
-            </w:r>
-            <w:r>
-              <w:rPr>
-                <w:lang w:val="en-US"/>
-              </w:rPr>
-              <w:lastRenderedPageBreak/>
-              <w:t>ration,DC=corp,DC=voyageurtransportation,DC=ca</w:t>
+              <w:t>CN=London970CoLo,CN=Sites,CN=Configuration,DC=corp,DC=voyageurtransportation,DC=ca</w:t>
+            </w:r>
+          </w:p>
+        </w:tc>
+        <w:tc>
+          <w:tcPr>
+            <w:tcW w:w="1872" w:type="dxa"/>
+          </w:tcPr>
+          <w:p>
+            <w:pPr>
+              <w:rPr>
+                <w:lang w:val="en-US"/>
+              </w:rPr>
+            </w:pPr>
+          </w:p>
+        </w:tc>
+        <w:tc>
+          <w:tcPr>
+            <w:tcW w:w="1872" w:type="dxa"/>
+          </w:tcPr>
+          <w:p>
+            <w:pPr>
+              <w:rPr>
+                <w:lang w:val="en-US"/>
+              </w:rPr>
+            </w:pPr>
+            <w:r>
+              <w:rPr>
+                <w:lang w:val="en-US"/>
+              </w:rPr>
+              <w:t>CN=10.1.55.0/24,CN=Subnets,CN=Sites,CN=Configuration,DC=corp,DC=voyageurtransportation,DC=ca</w:t>
             </w:r>
           </w:p>
         </w:tc>
@@ -9979,51 +9964,37 @@
               <w:rPr>
                 <w:lang w:val="en-US"/>
               </w:rPr>
-              <w:t>CN=London970CoLo,CN=Sites,CN=Configuration,DC=corp,DC=voyage</w:t>
-            </w:r>
-            <w:r>
-              <w:rPr>
-                <w:lang w:val="en-US"/>
-              </w:rPr>
-              <w:lastRenderedPageBreak/>
-              <w:t>urtransportation,DC=ca</w:t>
-            </w:r>
-          </w:p>
-        </w:tc>
-        <w:tc>
-          <w:tcPr>
-            <w:tcW w:w="1872" w:type="dxa"/>
-          </w:tcPr>
-          <w:p>
-            <w:pPr>
-              <w:rPr>
-                <w:lang w:val="en-US"/>
-              </w:rPr>
-            </w:pPr>
-          </w:p>
-        </w:tc>
-        <w:tc>
-          <w:tcPr>
-            <w:tcW w:w="1872" w:type="dxa"/>
-          </w:tcPr>
-          <w:p>
-            <w:pPr>
-              <w:rPr>
-                <w:lang w:val="en-US"/>
-              </w:rPr>
-            </w:pPr>
-            <w:r>
-              <w:rPr>
-                <w:lang w:val="en-US"/>
-              </w:rPr>
-              <w:t>CN=10.200.10.0/24,CN=Subnets,CN=Sites,CN=Configuration,DC=corp,</w:t>
-            </w:r>
-            <w:r>
-              <w:rPr>
-                <w:lang w:val="en-US"/>
-              </w:rPr>
-              <w:lastRenderedPageBreak/>
-              <w:t>DC=voyageurtransportation,DC=ca</w:t>
+              <w:t>CN=London970CoLo,CN=Sites,CN=Configuration,DC=corp,DC=voyageurtransportation,DC=ca</w:t>
+            </w:r>
+          </w:p>
+        </w:tc>
+        <w:tc>
+          <w:tcPr>
+            <w:tcW w:w="1872" w:type="dxa"/>
+          </w:tcPr>
+          <w:p>
+            <w:pPr>
+              <w:rPr>
+                <w:lang w:val="en-US"/>
+              </w:rPr>
+            </w:pPr>
+          </w:p>
+        </w:tc>
+        <w:tc>
+          <w:tcPr>
+            <w:tcW w:w="1872" w:type="dxa"/>
+          </w:tcPr>
+          <w:p>
+            <w:pPr>
+              <w:rPr>
+                <w:lang w:val="en-US"/>
+              </w:rPr>
+            </w:pPr>
+            <w:r>
+              <w:rPr>
+                <w:lang w:val="en-US"/>
+              </w:rPr>
+              <w:t>CN=10.200.10.0/24,CN=Subnets,CN=Sites,CN=Configuration,DC=corp,DC=voyageurtransportation,DC=ca</w:t>
             </w:r>
           </w:p>
         </w:tc>
@@ -10752,51 +10723,37 @@
               <w:rPr>
                 <w:lang w:val="en-US"/>
               </w:rPr>
-              <w:t>CN=London970CoLo,CN=Sites,CN=Configuration,DC=corp,DC=voyage</w:t>
-            </w:r>
-            <w:r>
-              <w:rPr>
-                <w:lang w:val="en-US"/>
-              </w:rPr>
-              <w:lastRenderedPageBreak/>
-              <w:t>urtransportation,DC=ca</w:t>
-            </w:r>
-          </w:p>
-        </w:tc>
-        <w:tc>
-          <w:tcPr>
-            <w:tcW w:w="1872" w:type="dxa"/>
-          </w:tcPr>
-          <w:p>
-            <w:pPr>
-              <w:rPr>
-                <w:lang w:val="en-US"/>
-              </w:rPr>
-            </w:pPr>
-          </w:p>
-        </w:tc>
-        <w:tc>
-          <w:tcPr>
-            <w:tcW w:w="1872" w:type="dxa"/>
-          </w:tcPr>
-          <w:p>
-            <w:pPr>
-              <w:rPr>
-                <w:lang w:val="en-US"/>
-              </w:rPr>
-            </w:pPr>
-            <w:r>
-              <w:rPr>
-                <w:lang w:val="en-US"/>
-              </w:rPr>
-              <w:t>CN=10.40.72.192/26,CN=Subnets,CN=Sites,CN=Configuration,DC=corp,</w:t>
-            </w:r>
-            <w:r>
-              <w:rPr>
-                <w:lang w:val="en-US"/>
-              </w:rPr>
-              <w:lastRenderedPageBreak/>
-              <w:t>DC=voyageurtransportation,DC=ca</w:t>
+              <w:t>CN=London970CoLo,CN=Sites,CN=Configuration,DC=corp,DC=voyageurtransportation,DC=ca</w:t>
+            </w:r>
+          </w:p>
+        </w:tc>
+        <w:tc>
+          <w:tcPr>
+            <w:tcW w:w="1872" w:type="dxa"/>
+          </w:tcPr>
+          <w:p>
+            <w:pPr>
+              <w:rPr>
+                <w:lang w:val="en-US"/>
+              </w:rPr>
+            </w:pPr>
+          </w:p>
+        </w:tc>
+        <w:tc>
+          <w:tcPr>
+            <w:tcW w:w="1872" w:type="dxa"/>
+          </w:tcPr>
+          <w:p>
+            <w:pPr>
+              <w:rPr>
+                <w:lang w:val="en-US"/>
+              </w:rPr>
+            </w:pPr>
+            <w:r>
+              <w:rPr>
+                <w:lang w:val="en-US"/>
+              </w:rPr>
+              <w:t>CN=10.40.72.192/26,CN=Subnets,CN=Sites,CN=Configuration,DC=corp,DC=voyageurtransportation,DC=ca</w:t>
             </w:r>
           </w:p>
         </w:tc>
@@ -11530,7 +11487,6 @@
                 <w:color w:val="FFFFFF"/>
                 <w:lang w:val="en-US"/>
               </w:rPr>
-              <w:lastRenderedPageBreak/>
               <w:t>Trust Name</w:t>
             </w:r>
           </w:p>
@@ -12941,7 +12897,6 @@
               <w:rPr>
                 <w:lang w:val="en-US"/>
               </w:rPr>
-              <w:lastRenderedPageBreak/>
               <w:t>Reversible Encryption Enabled</w:t>
             </w:r>
           </w:p>
@@ -15053,7 +15008,6 @@
               <w:rPr>
                 <w:lang w:val="en-US"/>
               </w:rPr>
-              <w:lastRenderedPageBreak/>
               <w:t>PRINTSRV-HAN-MAIN (IR-ADV-C3725)</w:t>
             </w:r>
           </w:p>
@@ -16101,7 +16055,6 @@
               <w:rPr>
                 <w:lang w:val="en-US"/>
               </w:rPr>
-              <w:lastRenderedPageBreak/>
               <w:t>PRINTSRV-LDN-SOV-MAIN (HP Color LaserJet MFP M577 )</w:t>
             </w:r>
           </w:p>
@@ -17087,7 +17040,6 @@
               <w:rPr>
                 <w:lang w:val="en-US"/>
               </w:rPr>
-              <w:lastRenderedPageBreak/>
               <w:t>PRINTSRV-WSTK-MAIN (HP Color LaserJet MFP E57540)</w:t>
             </w:r>
           </w:p>
@@ -19605,7 +19557,6 @@
               <w:rPr>
                 <w:lang w:val="en-US"/>
               </w:rPr>
-              <w:lastRenderedPageBreak/>
               <w:t>Mechanics8</w:t>
             </w:r>
           </w:p>
@@ -23330,7 +23281,6 @@
                 <w:color w:val="FFFFFF"/>
                 <w:lang w:val="en-US"/>
               </w:rPr>
-              <w:lastRenderedPageBreak/>
               <w:t>Account</w:t>
             </w:r>
           </w:p>

</xml_diff>

<commit_message>
Fixed 18/19 sections: Column mappings for OU Depth & Domain Discovery, type conversions, property validation
</commit_message>
<xml_diff>
--- a/output/assessments/MyAssessment.docx
+++ b/output/assessments/MyAssessment.docx
@@ -661,7 +661,6 @@
       </w:pPr>
       <w:bookmarkStart w:id="2" w:name="_Toc218508591"/>
       <w:r>
-        <w:lastRenderedPageBreak/>
         <w:t>Document Information</w:t>
       </w:r>
       <w:bookmarkEnd w:id="2"/>
@@ -1382,6 +1381,7 @@
               </w:rPr>
               <w:t>N</w:t>
             </w:r>
+            <w:proofErr w:type="spellStart"/>
             <w:r>
               <w:rPr>
                 <w:color w:val="4B4B4B" w:themeColor="accent6"/>
@@ -1389,6 +1389,7 @@
               </w:rPr>
               <w:t>ame</w:t>
             </w:r>
+            <w:proofErr w:type="spellEnd"/>
             <w:r>
               <w:rPr>
                 <w:color w:val="4B4B4B" w:themeColor="accent6"/>
@@ -1787,7 +1788,6 @@
           <w:sz w:val="32"/>
           <w:szCs w:val="28"/>
         </w:rPr>
-        <w:lastRenderedPageBreak/>
         <w:t>Table of Contents</w:t>
       </w:r>
       <w:bookmarkStart w:id="6" w:name="_Toc486577333"/>
@@ -6733,7 +6733,6 @@
         </w:rPr>
       </w:pPr>
       <w:r>
-        <w:lastRenderedPageBreak/>
         <w:fldChar w:fldCharType="end"/>
       </w:r>
       <w:r>
@@ -6746,7 +6745,6 @@
       </w:pPr>
       <w:bookmarkStart w:id="12" w:name="_Toc218508595"/>
       <w:r>
-        <w:lastRenderedPageBreak/>
         <w:t>Executive Summary</w:t>
       </w:r>
       <w:bookmarkEnd w:id="12"/>
@@ -6979,7 +6977,6 @@
         <w:rPr>
           <w:u w:color="FFFFFF"/>
         </w:rPr>
-        <w:lastRenderedPageBreak/>
         <w:t>Active Directory Assessment</w:t>
       </w:r>
       <w:bookmarkEnd w:id="16"/>
@@ -7537,6 +7534,7 @@
                 <w:lang w:val="en-US"/>
               </w:rPr>
             </w:pPr>
+            <w:proofErr w:type="spellStart"/>
             <w:r>
               <w:rPr>
                 <w:b/>
@@ -7545,6 +7543,7 @@
               </w:rPr>
               <w:t>IsKnownSuffix</w:t>
             </w:r>
+            <w:proofErr w:type="spellEnd"/>
           </w:p>
         </w:tc>
         <w:tc>
@@ -7559,6 +7558,7 @@
                 <w:lang w:val="en-US"/>
               </w:rPr>
             </w:pPr>
+            <w:proofErr w:type="spellStart"/>
             <w:r>
               <w:rPr>
                 <w:b/>
@@ -7567,6 +7567,7 @@
               </w:rPr>
               <w:t>IsNonRoutable</w:t>
             </w:r>
+            <w:proofErr w:type="spellEnd"/>
           </w:p>
         </w:tc>
       </w:tr>
@@ -8393,6 +8394,7 @@
                 <w:lang w:val="en-US"/>
               </w:rPr>
             </w:pPr>
+            <w:proofErr w:type="spellStart"/>
             <w:r>
               <w:rPr>
                 <w:b/>
@@ -8401,6 +8403,7 @@
               </w:rPr>
               <w:t>DistinguishedName</w:t>
             </w:r>
+            <w:proofErr w:type="spellEnd"/>
           </w:p>
         </w:tc>
         <w:tc>
@@ -8626,6 +8629,7 @@
                 <w:lang w:val="en-US"/>
               </w:rPr>
             </w:pPr>
+            <w:proofErr w:type="spellStart"/>
             <w:r>
               <w:rPr>
                 <w:b/>
@@ -8634,6 +8638,7 @@
               </w:rPr>
               <w:t>DistinguishedName</w:t>
             </w:r>
+            <w:proofErr w:type="spellEnd"/>
           </w:p>
         </w:tc>
         <w:tc>
@@ -11604,12 +11609,14 @@
                 <w:lang w:val="en-US"/>
               </w:rPr>
             </w:pPr>
+            <w:proofErr w:type="spellStart"/>
             <w:r>
               <w:rPr>
                 <w:lang w:val="en-US"/>
               </w:rPr>
               <w:t>BiDirectional</w:t>
             </w:r>
+            <w:proofErr w:type="spellEnd"/>
           </w:p>
         </w:tc>
         <w:tc>
@@ -13747,12 +13754,14 @@
                 <w:lang w:val="en-US"/>
               </w:rPr>
             </w:pPr>
+            <w:proofErr w:type="spellStart"/>
             <w:r>
               <w:rPr>
                 <w:lang w:val="en-US"/>
               </w:rPr>
               <w:t>DomainLocal</w:t>
             </w:r>
+            <w:proofErr w:type="spellEnd"/>
           </w:p>
         </w:tc>
         <w:tc>
@@ -14169,12 +14178,14 @@
                 <w:lang w:val="en-US"/>
               </w:rPr>
             </w:pPr>
+            <w:proofErr w:type="spellStart"/>
             <w:r>
               <w:rPr>
                 <w:lang w:val="en-US"/>
               </w:rPr>
               <w:t>DomainLocal</w:t>
             </w:r>
+            <w:proofErr w:type="spellEnd"/>
           </w:p>
         </w:tc>
         <w:tc>
@@ -14595,7 +14606,21 @@
               <w:rPr>
                 <w:lang w:val="en-US"/>
               </w:rPr>
-              <w:t>PRINTSRV-BRANT-MAIN (Tobisba e-Studio 2515ac)</w:t>
+              <w:t>PRINTSRV-BRANT-MAIN (</w:t>
+            </w:r>
+            <w:proofErr w:type="spellStart"/>
+            <w:r>
+              <w:rPr>
+                <w:lang w:val="en-US"/>
+              </w:rPr>
+              <w:t>Tobisba</w:t>
+            </w:r>
+            <w:proofErr w:type="spellEnd"/>
+            <w:r>
+              <w:rPr>
+                <w:lang w:val="en-US"/>
+              </w:rPr>
+              <w:t xml:space="preserve"> e-Studio 2515ac)</w:t>
             </w:r>
           </w:p>
         </w:tc>
@@ -14613,7 +14638,21 @@
               <w:rPr>
                 <w:lang w:val="en-US"/>
               </w:rPr>
-              <w:t>\\PrintSRV.corp.voyageurtransportation.ca\BRANT-MAIN (Tobisba e-Studio 2515ac)</w:t>
+              <w:t>\\PrintSRV.corp.voyageurtransportation.ca\BRANT-MAIN (</w:t>
+            </w:r>
+            <w:proofErr w:type="spellStart"/>
+            <w:r>
+              <w:rPr>
+                <w:lang w:val="en-US"/>
+              </w:rPr>
+              <w:t>Tobisba</w:t>
+            </w:r>
+            <w:proofErr w:type="spellEnd"/>
+            <w:r>
+              <w:rPr>
+                <w:lang w:val="en-US"/>
+              </w:rPr>
+              <w:t xml:space="preserve"> e-Studio 2515ac)</w:t>
             </w:r>
           </w:p>
         </w:tc>
@@ -14772,7 +14811,21 @@
               <w:rPr>
                 <w:lang w:val="en-US"/>
               </w:rPr>
-              <w:t>PRINTSRV-EFBL-Colour (HP Color LaserJet MFP M283fdw)</w:t>
+              <w:t>PRINTSRV-EFBL-</w:t>
+            </w:r>
+            <w:proofErr w:type="spellStart"/>
+            <w:r>
+              <w:rPr>
+                <w:lang w:val="en-US"/>
+              </w:rPr>
+              <w:t>Colour</w:t>
+            </w:r>
+            <w:proofErr w:type="spellEnd"/>
+            <w:r>
+              <w:rPr>
+                <w:lang w:val="en-US"/>
+              </w:rPr>
+              <w:t xml:space="preserve"> (HP Color LaserJet MFP M283fdw)</w:t>
             </w:r>
           </w:p>
         </w:tc>
@@ -14804,11 +14857,19 @@
                 <w:lang w:val="en-US"/>
               </w:rPr>
             </w:pPr>
-            <w:r>
-              <w:rPr>
-                <w:lang w:val="en-US"/>
-              </w:rPr>
-              <w:t>storville East Ferris</w:t>
+            <w:proofErr w:type="spellStart"/>
+            <w:r>
+              <w:rPr>
+                <w:lang w:val="en-US"/>
+              </w:rPr>
+              <w:t>storville</w:t>
+            </w:r>
+            <w:proofErr w:type="spellEnd"/>
+            <w:r>
+              <w:rPr>
+                <w:lang w:val="en-US"/>
+              </w:rPr>
+              <w:t xml:space="preserve"> East Ferris</w:t>
             </w:r>
           </w:p>
         </w:tc>
@@ -15044,7 +15105,21 @@
               <w:rPr>
                 <w:lang w:val="en-US"/>
               </w:rPr>
-              <w:t>301205 Knapville Hanover</w:t>
+              <w:t xml:space="preserve">301205 </w:t>
+            </w:r>
+            <w:proofErr w:type="spellStart"/>
+            <w:r>
+              <w:rPr>
+                <w:lang w:val="en-US"/>
+              </w:rPr>
+              <w:t>Knapville</w:t>
+            </w:r>
+            <w:proofErr w:type="spellEnd"/>
+            <w:r>
+              <w:rPr>
+                <w:lang w:val="en-US"/>
+              </w:rPr>
+              <w:t xml:space="preserve"> Hanover</w:t>
             </w:r>
           </w:p>
         </w:tc>
@@ -15595,7 +15670,21 @@
               <w:rPr>
                 <w:lang w:val="en-US"/>
               </w:rPr>
-              <w:t>PRINTSRV-LDN-ADM-Zebra (ZDesigner GK420d)</w:t>
+              <w:t>PRINTSRV-LDN-ADM-Zebra (</w:t>
+            </w:r>
+            <w:proofErr w:type="spellStart"/>
+            <w:r>
+              <w:rPr>
+                <w:lang w:val="en-US"/>
+              </w:rPr>
+              <w:t>ZDesigner</w:t>
+            </w:r>
+            <w:proofErr w:type="spellEnd"/>
+            <w:r>
+              <w:rPr>
+                <w:lang w:val="en-US"/>
+              </w:rPr>
+              <w:t xml:space="preserve"> GK420d)</w:t>
             </w:r>
           </w:p>
         </w:tc>
@@ -15613,7 +15702,21 @@
               <w:rPr>
                 <w:lang w:val="en-US"/>
               </w:rPr>
-              <w:t>\\PrintSRV.corp.voyageurtransportation.ca\LDN-ADM-Zebra (ZDesigner GK420d)</w:t>
+              <w:t>\\PrintSRV.corp.voyageurtransportation.ca\LDN-ADM-Zebra (</w:t>
+            </w:r>
+            <w:proofErr w:type="spellStart"/>
+            <w:r>
+              <w:rPr>
+                <w:lang w:val="en-US"/>
+              </w:rPr>
+              <w:t>ZDesigner</w:t>
+            </w:r>
+            <w:proofErr w:type="spellEnd"/>
+            <w:r>
+              <w:rPr>
+                <w:lang w:val="en-US"/>
+              </w:rPr>
+              <w:t xml:space="preserve"> GK420d)</w:t>
             </w:r>
           </w:p>
         </w:tc>
@@ -15908,8 +16011,16 @@
               <w:rPr>
                 <w:lang w:val="en-US"/>
               </w:rPr>
-              <w:t>London - Liberty - 2nd Flr</w:t>
-            </w:r>
+              <w:t xml:space="preserve">London - Liberty - 2nd </w:t>
+            </w:r>
+            <w:proofErr w:type="spellStart"/>
+            <w:r>
+              <w:rPr>
+                <w:lang w:val="en-US"/>
+              </w:rPr>
+              <w:t>Flr</w:t>
+            </w:r>
+            <w:proofErr w:type="spellEnd"/>
           </w:p>
         </w:tc>
       </w:tr>
@@ -16114,7 +16225,21 @@
               <w:rPr>
                 <w:lang w:val="en-US"/>
               </w:rPr>
-              <w:t>PRINTSRV-NEW-LISKEARD-MAIN (iR-ADV C257)</w:t>
+              <w:t>PRINTSRV-NEW-LISKEARD-MAIN (</w:t>
+            </w:r>
+            <w:proofErr w:type="spellStart"/>
+            <w:r>
+              <w:rPr>
+                <w:lang w:val="en-US"/>
+              </w:rPr>
+              <w:t>iR</w:t>
+            </w:r>
+            <w:proofErr w:type="spellEnd"/>
+            <w:r>
+              <w:rPr>
+                <w:lang w:val="en-US"/>
+              </w:rPr>
+              <w:t>-ADV C257)</w:t>
             </w:r>
           </w:p>
         </w:tc>
@@ -16132,7 +16257,21 @@
               <w:rPr>
                 <w:lang w:val="en-US"/>
               </w:rPr>
-              <w:t>\\PrintSRV.corp.voyageurtransportation.ca\NEW-LISKEARD-MAIN (iR-ADV C257)</w:t>
+              <w:t>\\PrintSRV.corp.voyageurtransportation.ca\NEW-LISKEARD-MAIN (</w:t>
+            </w:r>
+            <w:proofErr w:type="spellStart"/>
+            <w:r>
+              <w:rPr>
+                <w:lang w:val="en-US"/>
+              </w:rPr>
+              <w:t>iR</w:t>
+            </w:r>
+            <w:proofErr w:type="spellEnd"/>
+            <w:r>
+              <w:rPr>
+                <w:lang w:val="en-US"/>
+              </w:rPr>
+              <w:t>-ADV C257)</w:t>
             </w:r>
           </w:p>
         </w:tc>
@@ -16574,7 +16713,21 @@
               <w:rPr>
                 <w:lang w:val="en-US"/>
               </w:rPr>
-              <w:t>PRINTSRV-OWEN-TERM (HP ColorJet MFP E47528)</w:t>
+              <w:t xml:space="preserve">PRINTSRV-OWEN-TERM (HP </w:t>
+            </w:r>
+            <w:proofErr w:type="spellStart"/>
+            <w:r>
+              <w:rPr>
+                <w:lang w:val="en-US"/>
+              </w:rPr>
+              <w:t>ColorJet</w:t>
+            </w:r>
+            <w:proofErr w:type="spellEnd"/>
+            <w:r>
+              <w:rPr>
+                <w:lang w:val="en-US"/>
+              </w:rPr>
+              <w:t xml:space="preserve"> MFP E47528)</w:t>
             </w:r>
           </w:p>
         </w:tc>
@@ -16592,7 +16745,21 @@
               <w:rPr>
                 <w:lang w:val="en-US"/>
               </w:rPr>
-              <w:t>\\PrintSRV.corp.voyageurtransportation.ca\OWEN-TERM (HP ColorJet MFP E47528)</w:t>
+              <w:t xml:space="preserve">\\PrintSRV.corp.voyageurtransportation.ca\OWEN-TERM (HP </w:t>
+            </w:r>
+            <w:proofErr w:type="spellStart"/>
+            <w:r>
+              <w:rPr>
+                <w:lang w:val="en-US"/>
+              </w:rPr>
+              <w:t>ColorJet</w:t>
+            </w:r>
+            <w:proofErr w:type="spellEnd"/>
+            <w:r>
+              <w:rPr>
+                <w:lang w:val="en-US"/>
+              </w:rPr>
+              <w:t xml:space="preserve"> MFP E47528)</w:t>
             </w:r>
           </w:p>
         </w:tc>
@@ -16919,7 +17086,21 @@
               <w:rPr>
                 <w:lang w:val="en-US"/>
               </w:rPr>
-              <w:t>PRINTSRV-WELL-MAIN (Canon iR-ADV C259 )</w:t>
+              <w:t xml:space="preserve">PRINTSRV-WELL-MAIN (Canon </w:t>
+            </w:r>
+            <w:proofErr w:type="spellStart"/>
+            <w:r>
+              <w:rPr>
+                <w:lang w:val="en-US"/>
+              </w:rPr>
+              <w:t>iR</w:t>
+            </w:r>
+            <w:proofErr w:type="spellEnd"/>
+            <w:r>
+              <w:rPr>
+                <w:lang w:val="en-US"/>
+              </w:rPr>
+              <w:t>-ADV C259 )</w:t>
             </w:r>
           </w:p>
         </w:tc>
@@ -16937,7 +17118,21 @@
               <w:rPr>
                 <w:lang w:val="en-US"/>
               </w:rPr>
-              <w:t>\\PrintSRV.corp.voyageurtransportation.ca\WELL-MAIN (Canon iR-ADV C259 )</w:t>
+              <w:t xml:space="preserve">\\PrintSRV.corp.voyageurtransportation.ca\WELL-MAIN (Canon </w:t>
+            </w:r>
+            <w:proofErr w:type="spellStart"/>
+            <w:r>
+              <w:rPr>
+                <w:lang w:val="en-US"/>
+              </w:rPr>
+              <w:t>iR</w:t>
+            </w:r>
+            <w:proofErr w:type="spellEnd"/>
+            <w:r>
+              <w:rPr>
+                <w:lang w:val="en-US"/>
+              </w:rPr>
+              <w:t>-ADV C259 )</w:t>
             </w:r>
           </w:p>
         </w:tc>
@@ -16951,12 +17146,28 @@
                 <w:lang w:val="en-US"/>
               </w:rPr>
             </w:pPr>
-            <w:r>
-              <w:rPr>
-                <w:lang w:val="en-US"/>
-              </w:rPr>
-              <w:t>Welland, Onatario</w:t>
-            </w:r>
+            <w:proofErr w:type="spellStart"/>
+            <w:r>
+              <w:rPr>
+                <w:lang w:val="en-US"/>
+              </w:rPr>
+              <w:t>Welland</w:t>
+            </w:r>
+            <w:proofErr w:type="spellEnd"/>
+            <w:r>
+              <w:rPr>
+                <w:lang w:val="en-US"/>
+              </w:rPr>
+              <w:t xml:space="preserve">, </w:t>
+            </w:r>
+            <w:proofErr w:type="spellStart"/>
+            <w:r>
+              <w:rPr>
+                <w:lang w:val="en-US"/>
+              </w:rPr>
+              <w:t>Onatario</w:t>
+            </w:r>
+            <w:proofErr w:type="spellEnd"/>
           </w:p>
         </w:tc>
       </w:tr>
@@ -17132,7 +17343,21 @@
               <w:rPr>
                 <w:lang w:val="en-US"/>
               </w:rPr>
-              <w:t>23 Cardico Dr Gormley</w:t>
+              <w:t xml:space="preserve">23 </w:t>
+            </w:r>
+            <w:proofErr w:type="spellStart"/>
+            <w:r>
+              <w:rPr>
+                <w:lang w:val="en-US"/>
+              </w:rPr>
+              <w:t>Cardico</w:t>
+            </w:r>
+            <w:proofErr w:type="spellEnd"/>
+            <w:r>
+              <w:rPr>
+                <w:lang w:val="en-US"/>
+              </w:rPr>
+              <w:t xml:space="preserve"> Dr Gormley</w:t>
             </w:r>
           </w:p>
         </w:tc>
@@ -17217,7 +17442,21 @@
               <w:rPr>
                 <w:lang w:val="en-US"/>
               </w:rPr>
-              <w:t>PRINTSRV-YORK-SCH (iR-ADV C5540 III)</w:t>
+              <w:t>PRINTSRV-YORK-SCH (</w:t>
+            </w:r>
+            <w:proofErr w:type="spellStart"/>
+            <w:r>
+              <w:rPr>
+                <w:lang w:val="en-US"/>
+              </w:rPr>
+              <w:t>iR</w:t>
+            </w:r>
+            <w:proofErr w:type="spellEnd"/>
+            <w:r>
+              <w:rPr>
+                <w:lang w:val="en-US"/>
+              </w:rPr>
+              <w:t>-ADV C5540 III)</w:t>
             </w:r>
           </w:p>
         </w:tc>
@@ -17235,7 +17474,21 @@
               <w:rPr>
                 <w:lang w:val="en-US"/>
               </w:rPr>
-              <w:t>\\PrintSRV.corp.voyageurtransportation.ca\YORK-SCH (iR-ADV C5540 III)</w:t>
+              <w:t>\\PrintSRV.corp.voyageurtransportation.ca\YORK-SCH (</w:t>
+            </w:r>
+            <w:proofErr w:type="spellStart"/>
+            <w:r>
+              <w:rPr>
+                <w:lang w:val="en-US"/>
+              </w:rPr>
+              <w:t>iR</w:t>
+            </w:r>
+            <w:proofErr w:type="spellEnd"/>
+            <w:r>
+              <w:rPr>
+                <w:lang w:val="en-US"/>
+              </w:rPr>
+              <w:t>-ADV C5540 III)</w:t>
             </w:r>
           </w:p>
         </w:tc>
@@ -17555,12 +17808,14 @@
                 <w:lang w:val="en-US"/>
               </w:rPr>
             </w:pPr>
+            <w:proofErr w:type="spellStart"/>
             <w:r>
               <w:rPr>
                 <w:lang w:val="en-US"/>
               </w:rPr>
               <w:t>TsInternetUser</w:t>
             </w:r>
+            <w:proofErr w:type="spellEnd"/>
           </w:p>
         </w:tc>
         <w:tc>
@@ -17742,12 +17997,14 @@
                 <w:lang w:val="en-US"/>
               </w:rPr>
             </w:pPr>
+            <w:proofErr w:type="spellStart"/>
             <w:r>
               <w:rPr>
                 <w:lang w:val="en-US"/>
               </w:rPr>
               <w:t>SQLExecutiveCmdExec</w:t>
             </w:r>
+            <w:proofErr w:type="spellEnd"/>
           </w:p>
         </w:tc>
         <w:tc>
@@ -17834,12 +18091,14 @@
                 <w:lang w:val="en-US"/>
               </w:rPr>
             </w:pPr>
+            <w:proofErr w:type="spellStart"/>
             <w:r>
               <w:rPr>
                 <w:lang w:val="en-US"/>
               </w:rPr>
               <w:t>SQLAgentCmdExec</w:t>
             </w:r>
+            <w:proofErr w:type="spellEnd"/>
           </w:p>
         </w:tc>
         <w:tc>
@@ -17923,12 +18182,14 @@
                 <w:lang w:val="en-US"/>
               </w:rPr>
             </w:pPr>
+            <w:proofErr w:type="spellStart"/>
             <w:r>
               <w:rPr>
                 <w:lang w:val="en-US"/>
               </w:rPr>
               <w:t>krbtgt</w:t>
             </w:r>
+            <w:proofErr w:type="spellEnd"/>
           </w:p>
         </w:tc>
         <w:tc>
@@ -18015,12 +18276,14 @@
                 <w:lang w:val="en-US"/>
               </w:rPr>
             </w:pPr>
+            <w:proofErr w:type="spellStart"/>
             <w:r>
               <w:rPr>
                 <w:lang w:val="en-US"/>
               </w:rPr>
               <w:t>jh.admin</w:t>
             </w:r>
+            <w:proofErr w:type="spellEnd"/>
           </w:p>
         </w:tc>
         <w:tc>
@@ -18110,12 +18373,14 @@
                 <w:lang w:val="en-US"/>
               </w:rPr>
             </w:pPr>
+            <w:proofErr w:type="spellStart"/>
             <w:r>
               <w:rPr>
                 <w:lang w:val="en-US"/>
               </w:rPr>
               <w:t>netskope</w:t>
             </w:r>
+            <w:proofErr w:type="spellEnd"/>
           </w:p>
         </w:tc>
         <w:tc>
@@ -18208,12 +18473,14 @@
                 <w:lang w:val="en-US"/>
               </w:rPr>
             </w:pPr>
+            <w:proofErr w:type="spellStart"/>
             <w:r>
               <w:rPr>
                 <w:lang w:val="en-US"/>
               </w:rPr>
               <w:t>veeambackup</w:t>
             </w:r>
+            <w:proofErr w:type="spellEnd"/>
           </w:p>
         </w:tc>
         <w:tc>
@@ -18395,12 +18662,14 @@
                 <w:lang w:val="en-US"/>
               </w:rPr>
             </w:pPr>
+            <w:proofErr w:type="spellStart"/>
             <w:r>
               <w:rPr>
                 <w:lang w:val="en-US"/>
               </w:rPr>
               <w:t>gtatrainer</w:t>
             </w:r>
+            <w:proofErr w:type="spellEnd"/>
           </w:p>
         </w:tc>
         <w:tc>
@@ -18974,12 +19243,14 @@
                 <w:lang w:val="en-US"/>
               </w:rPr>
             </w:pPr>
+            <w:proofErr w:type="spellStart"/>
             <w:r>
               <w:rPr>
                 <w:lang w:val="en-US"/>
               </w:rPr>
               <w:t>winfuel</w:t>
             </w:r>
+            <w:proofErr w:type="spellEnd"/>
           </w:p>
         </w:tc>
         <w:tc>
@@ -19167,12 +19438,14 @@
                 <w:lang w:val="en-US"/>
               </w:rPr>
             </w:pPr>
+            <w:proofErr w:type="spellStart"/>
             <w:r>
               <w:rPr>
                 <w:lang w:val="en-US"/>
               </w:rPr>
               <w:t>scantofile</w:t>
             </w:r>
+            <w:proofErr w:type="spellEnd"/>
           </w:p>
         </w:tc>
         <w:tc>
@@ -19360,12 +19633,14 @@
                 <w:lang w:val="en-US"/>
               </w:rPr>
             </w:pPr>
+            <w:proofErr w:type="spellStart"/>
             <w:r>
               <w:rPr>
                 <w:lang w:val="en-US"/>
               </w:rPr>
               <w:t>mechanictmp</w:t>
             </w:r>
+            <w:proofErr w:type="spellEnd"/>
           </w:p>
         </w:tc>
         <w:tc>
@@ -19746,12 +20021,14 @@
                 <w:lang w:val="en-US"/>
               </w:rPr>
             </w:pPr>
+            <w:proofErr w:type="spellStart"/>
             <w:r>
               <w:rPr>
                 <w:lang w:val="en-US"/>
               </w:rPr>
               <w:t>scantofolder</w:t>
             </w:r>
+            <w:proofErr w:type="spellEnd"/>
           </w:p>
         </w:tc>
         <w:tc>
@@ -19841,12 +20118,14 @@
                 <w:lang w:val="en-US"/>
               </w:rPr>
             </w:pPr>
+            <w:proofErr w:type="spellStart"/>
             <w:r>
               <w:rPr>
                 <w:lang w:val="en-US"/>
               </w:rPr>
               <w:t>brantmechanic</w:t>
             </w:r>
+            <w:proofErr w:type="spellEnd"/>
           </w:p>
         </w:tc>
         <w:tc>
@@ -20034,12 +20313,14 @@
                 <w:lang w:val="en-US"/>
               </w:rPr>
             </w:pPr>
+            <w:proofErr w:type="spellStart"/>
             <w:r>
               <w:rPr>
                 <w:lang w:val="en-US"/>
               </w:rPr>
               <w:t>OSTraining</w:t>
             </w:r>
+            <w:proofErr w:type="spellEnd"/>
           </w:p>
         </w:tc>
         <w:tc>
@@ -20221,12 +20502,14 @@
                 <w:lang w:val="en-US"/>
               </w:rPr>
             </w:pPr>
+            <w:proofErr w:type="spellStart"/>
             <w:r>
               <w:rPr>
                 <w:lang w:val="en-US"/>
               </w:rPr>
               <w:t>svcVCenterAdmin</w:t>
             </w:r>
+            <w:proofErr w:type="spellEnd"/>
           </w:p>
         </w:tc>
         <w:tc>
@@ -20319,12 +20602,14 @@
                 <w:lang w:val="en-US"/>
               </w:rPr>
             </w:pPr>
+            <w:proofErr w:type="spellStart"/>
             <w:r>
               <w:rPr>
                 <w:lang w:val="en-US"/>
               </w:rPr>
               <w:t>svcPNETGUIApps</w:t>
             </w:r>
+            <w:proofErr w:type="spellEnd"/>
           </w:p>
         </w:tc>
         <w:tc>
@@ -20412,7 +20697,21 @@
               <w:rPr>
                 <w:lang w:val="en-US"/>
               </w:rPr>
-              <w:t>___VMware_Conv_SA___</w:t>
+              <w:t>___</w:t>
+            </w:r>
+            <w:proofErr w:type="spellStart"/>
+            <w:r>
+              <w:rPr>
+                <w:lang w:val="en-US"/>
+              </w:rPr>
+              <w:t>VMware_Conv_SA</w:t>
+            </w:r>
+            <w:proofErr w:type="spellEnd"/>
+            <w:r>
+              <w:rPr>
+                <w:lang w:val="en-US"/>
+              </w:rPr>
+              <w:t>___</w:t>
             </w:r>
           </w:p>
         </w:tc>
@@ -20595,12 +20894,14 @@
                 <w:lang w:val="en-US"/>
               </w:rPr>
             </w:pPr>
+            <w:proofErr w:type="spellStart"/>
             <w:r>
               <w:rPr>
                 <w:lang w:val="en-US"/>
               </w:rPr>
               <w:t>sqlagent</w:t>
             </w:r>
+            <w:proofErr w:type="spellEnd"/>
           </w:p>
         </w:tc>
         <w:tc>
@@ -20693,12 +20994,14 @@
                 <w:lang w:val="en-US"/>
               </w:rPr>
             </w:pPr>
+            <w:proofErr w:type="spellStart"/>
             <w:r>
               <w:rPr>
                 <w:lang w:val="en-US"/>
               </w:rPr>
               <w:t>CWTraining</w:t>
             </w:r>
+            <w:proofErr w:type="spellEnd"/>
           </w:p>
         </w:tc>
         <w:tc>
@@ -20886,11 +21189,19 @@
                 <w:lang w:val="en-US"/>
               </w:rPr>
             </w:pPr>
-            <w:r>
-              <w:rPr>
-                <w:lang w:val="en-US"/>
-              </w:rPr>
-              <w:t>Fortigate-SA</w:t>
+            <w:proofErr w:type="spellStart"/>
+            <w:r>
+              <w:rPr>
+                <w:lang w:val="en-US"/>
+              </w:rPr>
+              <w:t>Fortigate</w:t>
+            </w:r>
+            <w:proofErr w:type="spellEnd"/>
+            <w:r>
+              <w:rPr>
+                <w:lang w:val="en-US"/>
+              </w:rPr>
+              <w:t>-SA</w:t>
             </w:r>
           </w:p>
         </w:tc>
@@ -20981,12 +21292,14 @@
                 <w:lang w:val="en-US"/>
               </w:rPr>
             </w:pPr>
+            <w:proofErr w:type="spellStart"/>
             <w:r>
               <w:rPr>
                 <w:lang w:val="en-US"/>
               </w:rPr>
               <w:t>ScanMIR</w:t>
             </w:r>
+            <w:proofErr w:type="spellEnd"/>
           </w:p>
         </w:tc>
         <w:tc>
@@ -21272,12 +21585,14 @@
                 <w:lang w:val="en-US"/>
               </w:rPr>
             </w:pPr>
+            <w:proofErr w:type="spellStart"/>
             <w:r>
               <w:rPr>
                 <w:lang w:val="en-US"/>
               </w:rPr>
               <w:t>eastferris.mechanic</w:t>
             </w:r>
+            <w:proofErr w:type="spellEnd"/>
           </w:p>
         </w:tc>
         <w:tc>
@@ -21367,12 +21682,14 @@
                 <w:lang w:val="en-US"/>
               </w:rPr>
             </w:pPr>
+            <w:proofErr w:type="spellStart"/>
             <w:r>
               <w:rPr>
                 <w:lang w:val="en-US"/>
               </w:rPr>
               <w:t>sagedotnet</w:t>
             </w:r>
+            <w:proofErr w:type="spellEnd"/>
           </w:p>
         </w:tc>
         <w:tc>
@@ -21741,12 +22058,14 @@
                 <w:lang w:val="en-US"/>
               </w:rPr>
             </w:pPr>
+            <w:proofErr w:type="spellStart"/>
             <w:r>
               <w:rPr>
                 <w:lang w:val="en-US"/>
               </w:rPr>
               <w:t>dattosrvc</w:t>
             </w:r>
+            <w:proofErr w:type="spellEnd"/>
           </w:p>
         </w:tc>
         <w:tc>
@@ -21833,12 +22152,14 @@
                 <w:lang w:val="en-US"/>
               </w:rPr>
             </w:pPr>
+            <w:proofErr w:type="spellStart"/>
             <w:r>
               <w:rPr>
                 <w:lang w:val="en-US"/>
               </w:rPr>
               <w:t>rdssrv</w:t>
             </w:r>
+            <w:proofErr w:type="spellEnd"/>
           </w:p>
         </w:tc>
         <w:tc>
@@ -21922,12 +22243,14 @@
                 <w:lang w:val="en-US"/>
               </w:rPr>
             </w:pPr>
+            <w:proofErr w:type="spellStart"/>
             <w:r>
               <w:rPr>
                 <w:lang w:val="en-US"/>
               </w:rPr>
               <w:t>ldapvoy</w:t>
             </w:r>
+            <w:proofErr w:type="spellEnd"/>
           </w:p>
         </w:tc>
         <w:tc>
@@ -22115,12 +22438,14 @@
                 <w:lang w:val="en-US"/>
               </w:rPr>
             </w:pPr>
+            <w:proofErr w:type="spellStart"/>
             <w:r>
               <w:rPr>
                 <w:lang w:val="en-US"/>
               </w:rPr>
               <w:t>Sudbury.Mechanic</w:t>
             </w:r>
+            <w:proofErr w:type="spellEnd"/>
           </w:p>
         </w:tc>
         <w:tc>
@@ -22213,12 +22538,14 @@
                 <w:lang w:val="en-US"/>
               </w:rPr>
             </w:pPr>
+            <w:proofErr w:type="spellStart"/>
             <w:r>
               <w:rPr>
                 <w:lang w:val="en-US"/>
               </w:rPr>
               <w:t>cwautosrv</w:t>
             </w:r>
+            <w:proofErr w:type="spellEnd"/>
           </w:p>
         </w:tc>
         <w:tc>
@@ -22308,12 +22635,14 @@
                 <w:lang w:val="en-US"/>
               </w:rPr>
             </w:pPr>
+            <w:proofErr w:type="spellStart"/>
             <w:r>
               <w:rPr>
                 <w:lang w:val="en-US"/>
               </w:rPr>
               <w:t>ldap_bind</w:t>
             </w:r>
+            <w:proofErr w:type="spellEnd"/>
           </w:p>
         </w:tc>
         <w:tc>
@@ -22501,12 +22830,14 @@
                 <w:lang w:val="en-US"/>
               </w:rPr>
             </w:pPr>
+            <w:proofErr w:type="spellStart"/>
             <w:r>
               <w:rPr>
                 <w:lang w:val="en-US"/>
               </w:rPr>
               <w:t>toronto.mechanic</w:t>
             </w:r>
+            <w:proofErr w:type="spellEnd"/>
           </w:p>
         </w:tc>
         <w:tc>
@@ -22599,12 +22930,14 @@
                 <w:lang w:val="en-US"/>
               </w:rPr>
             </w:pPr>
+            <w:proofErr w:type="spellStart"/>
             <w:r>
               <w:rPr>
                 <w:lang w:val="en-US"/>
               </w:rPr>
               <w:t>ca.vts.unif-serverag</w:t>
             </w:r>
+            <w:proofErr w:type="spellEnd"/>
           </w:p>
         </w:tc>
         <w:tc>
@@ -22688,12 +23021,14 @@
                 <w:lang w:val="en-US"/>
               </w:rPr>
             </w:pPr>
+            <w:proofErr w:type="spellStart"/>
             <w:r>
               <w:rPr>
                 <w:lang w:val="en-US"/>
               </w:rPr>
               <w:t>svcvCenterBkup</w:t>
             </w:r>
+            <w:proofErr w:type="spellEnd"/>
           </w:p>
         </w:tc>
         <w:tc>
@@ -22786,12 +23121,14 @@
                 <w:lang w:val="en-US"/>
               </w:rPr>
             </w:pPr>
+            <w:proofErr w:type="spellStart"/>
             <w:r>
               <w:rPr>
                 <w:lang w:val="en-US"/>
               </w:rPr>
               <w:t>svcGFCS</w:t>
             </w:r>
+            <w:proofErr w:type="spellEnd"/>
           </w:p>
         </w:tc>
         <w:tc>
@@ -22881,12 +23218,14 @@
                 <w:lang w:val="en-US"/>
               </w:rPr>
             </w:pPr>
+            <w:proofErr w:type="spellStart"/>
             <w:r>
               <w:rPr>
                 <w:lang w:val="en-US"/>
               </w:rPr>
               <w:t>svcSQLVSS</w:t>
             </w:r>
+            <w:proofErr w:type="spellEnd"/>
           </w:p>
         </w:tc>
         <w:tc>
@@ -23323,6 +23662,7 @@
                 <w:lang w:val="en-US"/>
               </w:rPr>
             </w:pPr>
+            <w:proofErr w:type="spellStart"/>
             <w:r>
               <w:rPr>
                 <w:rStyle w:val="Heading2Char"/>
@@ -23330,6 +23670,7 @@
               </w:rPr>
               <w:t>ad.admin</w:t>
             </w:r>
+            <w:proofErr w:type="spellEnd"/>
           </w:p>
         </w:tc>
         <w:tc>
@@ -23371,6 +23712,7 @@
                 <w:lang w:val="en-US"/>
               </w:rPr>
             </w:pPr>
+            <w:proofErr w:type="spellStart"/>
             <w:r>
               <w:rPr>
                 <w:rStyle w:val="Heading2Char"/>
@@ -23378,6 +23720,7 @@
               </w:rPr>
               <w:t>bill.oreily</w:t>
             </w:r>
+            <w:proofErr w:type="spellEnd"/>
           </w:p>
         </w:tc>
         <w:tc>
@@ -23416,6 +23759,7 @@
                 <w:lang w:val="en-US"/>
               </w:rPr>
             </w:pPr>
+            <w:proofErr w:type="spellStart"/>
             <w:r>
               <w:rPr>
                 <w:rStyle w:val="Heading2Char"/>
@@ -23423,6 +23767,7 @@
               </w:rPr>
               <w:t>ca.vts.unif-serverag</w:t>
             </w:r>
+            <w:proofErr w:type="spellEnd"/>
           </w:p>
         </w:tc>
         <w:tc>
@@ -23464,6 +23809,7 @@
                 <w:lang w:val="en-US"/>
               </w:rPr>
             </w:pPr>
+            <w:proofErr w:type="spellStart"/>
             <w:r>
               <w:rPr>
                 <w:rStyle w:val="Heading2Char"/>
@@ -23471,6 +23817,7 @@
               </w:rPr>
               <w:t>ck.admin</w:t>
             </w:r>
+            <w:proofErr w:type="spellEnd"/>
           </w:p>
         </w:tc>
         <w:tc>
@@ -23509,6 +23856,7 @@
                 <w:lang w:val="en-US"/>
               </w:rPr>
             </w:pPr>
+            <w:proofErr w:type="spellStart"/>
             <w:r>
               <w:rPr>
                 <w:rStyle w:val="Heading2Char"/>
@@ -23516,6 +23864,7 @@
               </w:rPr>
               <w:t>cwautosrv</w:t>
             </w:r>
+            <w:proofErr w:type="spellEnd"/>
           </w:p>
         </w:tc>
         <w:tc>
@@ -23602,6 +23951,7 @@
                 <w:lang w:val="en-US"/>
               </w:rPr>
             </w:pPr>
+            <w:proofErr w:type="spellStart"/>
             <w:r>
               <w:rPr>
                 <w:rStyle w:val="Heading2Char"/>
@@ -23609,6 +23959,7 @@
               </w:rPr>
               <w:t>enaefe.admin</w:t>
             </w:r>
+            <w:proofErr w:type="spellEnd"/>
           </w:p>
         </w:tc>
         <w:tc>
@@ -23650,6 +24001,7 @@
                 <w:lang w:val="en-US"/>
               </w:rPr>
             </w:pPr>
+            <w:proofErr w:type="spellStart"/>
             <w:r>
               <w:rPr>
                 <w:rStyle w:val="Heading2Char"/>
@@ -23657,6 +24009,7 @@
               </w:rPr>
               <w:t>femi.admin</w:t>
             </w:r>
+            <w:proofErr w:type="spellEnd"/>
           </w:p>
         </w:tc>
         <w:tc>
@@ -23695,6 +24048,7 @@
                 <w:lang w:val="en-US"/>
               </w:rPr>
             </w:pPr>
+            <w:proofErr w:type="spellStart"/>
             <w:r>
               <w:rPr>
                 <w:rStyle w:val="Heading2Char"/>
@@ -23702,6 +24056,7 @@
               </w:rPr>
               <w:t>gm.admin</w:t>
             </w:r>
+            <w:proofErr w:type="spellEnd"/>
           </w:p>
         </w:tc>
         <w:tc>
@@ -23743,6 +24098,7 @@
                 <w:lang w:val="en-US"/>
               </w:rPr>
             </w:pPr>
+            <w:proofErr w:type="spellStart"/>
             <w:r>
               <w:rPr>
                 <w:rStyle w:val="Heading2Char"/>
@@ -23750,6 +24106,7 @@
               </w:rPr>
               <w:t>GM.local</w:t>
             </w:r>
+            <w:proofErr w:type="spellEnd"/>
           </w:p>
         </w:tc>
         <w:tc>
@@ -23788,6 +24145,7 @@
                 <w:lang w:val="en-US"/>
               </w:rPr>
             </w:pPr>
+            <w:proofErr w:type="spellStart"/>
             <w:r>
               <w:rPr>
                 <w:rStyle w:val="Heading2Char"/>
@@ -23795,6 +24153,7 @@
               </w:rPr>
               <w:t>jh.admin</w:t>
             </w:r>
+            <w:proofErr w:type="spellEnd"/>
           </w:p>
         </w:tc>
         <w:tc>
@@ -23836,6 +24195,7 @@
                 <w:lang w:val="en-US"/>
               </w:rPr>
             </w:pPr>
+            <w:proofErr w:type="spellStart"/>
             <w:r>
               <w:rPr>
                 <w:rStyle w:val="Heading2Char"/>
@@ -23843,6 +24203,7 @@
               </w:rPr>
               <w:t>jm.admin</w:t>
             </w:r>
+            <w:proofErr w:type="spellEnd"/>
           </w:p>
         </w:tc>
         <w:tc>
@@ -23881,6 +24242,7 @@
                 <w:lang w:val="en-US"/>
               </w:rPr>
             </w:pPr>
+            <w:proofErr w:type="spellStart"/>
             <w:r>
               <w:rPr>
                 <w:rStyle w:val="Heading2Char"/>
@@ -23888,6 +24250,7 @@
               </w:rPr>
               <w:t>kb.admin</w:t>
             </w:r>
+            <w:proofErr w:type="spellEnd"/>
           </w:p>
         </w:tc>
         <w:tc>
@@ -23929,6 +24292,7 @@
                 <w:lang w:val="en-US"/>
               </w:rPr>
             </w:pPr>
+            <w:proofErr w:type="spellStart"/>
             <w:r>
               <w:rPr>
                 <w:rStyle w:val="Heading2Char"/>
@@ -23936,6 +24300,7 @@
               </w:rPr>
               <w:t>kk.admin</w:t>
             </w:r>
+            <w:proofErr w:type="spellEnd"/>
           </w:p>
         </w:tc>
         <w:tc>
@@ -23974,6 +24339,7 @@
                 <w:lang w:val="en-US"/>
               </w:rPr>
             </w:pPr>
+            <w:proofErr w:type="spellStart"/>
             <w:r>
               <w:rPr>
                 <w:rStyle w:val="Heading2Char"/>
@@ -23981,6 +24347,7 @@
               </w:rPr>
               <w:t>krbtgt</w:t>
             </w:r>
+            <w:proofErr w:type="spellEnd"/>
           </w:p>
         </w:tc>
         <w:tc>
@@ -24022,6 +24389,7 @@
                 <w:lang w:val="en-US"/>
               </w:rPr>
             </w:pPr>
+            <w:proofErr w:type="spellStart"/>
             <w:r>
               <w:rPr>
                 <w:rStyle w:val="Heading2Char"/>
@@ -24029,6 +24397,7 @@
               </w:rPr>
               <w:t>ldap_bind</w:t>
             </w:r>
+            <w:proofErr w:type="spellEnd"/>
           </w:p>
         </w:tc>
         <w:tc>
@@ -24067,6 +24436,7 @@
                 <w:lang w:val="en-US"/>
               </w:rPr>
             </w:pPr>
+            <w:proofErr w:type="spellStart"/>
             <w:r>
               <w:rPr>
                 <w:rStyle w:val="Heading2Char"/>
@@ -24074,6 +24444,7 @@
               </w:rPr>
               <w:t>ldapvoy</w:t>
             </w:r>
+            <w:proofErr w:type="spellEnd"/>
           </w:p>
         </w:tc>
         <w:tc>
@@ -24115,6 +24486,7 @@
                 <w:lang w:val="en-US"/>
               </w:rPr>
             </w:pPr>
+            <w:proofErr w:type="spellStart"/>
             <w:r>
               <w:rPr>
                 <w:rStyle w:val="Heading2Char"/>
@@ -24122,6 +24494,7 @@
               </w:rPr>
               <w:t>mz.admin</w:t>
             </w:r>
+            <w:proofErr w:type="spellEnd"/>
           </w:p>
         </w:tc>
         <w:tc>
@@ -24160,6 +24533,7 @@
                 <w:lang w:val="en-US"/>
               </w:rPr>
             </w:pPr>
+            <w:proofErr w:type="spellStart"/>
             <w:r>
               <w:rPr>
                 <w:rStyle w:val="Heading2Char"/>
@@ -24167,6 +24541,7 @@
               </w:rPr>
               <w:t>netskope</w:t>
             </w:r>
+            <w:proofErr w:type="spellEnd"/>
           </w:p>
         </w:tc>
         <w:tc>
@@ -24208,6 +24583,7 @@
                 <w:lang w:val="en-US"/>
               </w:rPr>
             </w:pPr>
+            <w:proofErr w:type="spellStart"/>
             <w:r>
               <w:rPr>
                 <w:rStyle w:val="Heading2Char"/>
@@ -24215,6 +24591,7 @@
               </w:rPr>
               <w:t>olu.admin</w:t>
             </w:r>
+            <w:proofErr w:type="spellEnd"/>
           </w:p>
         </w:tc>
         <w:tc>
@@ -24253,6 +24630,7 @@
                 <w:lang w:val="en-US"/>
               </w:rPr>
             </w:pPr>
+            <w:proofErr w:type="spellStart"/>
             <w:r>
               <w:rPr>
                 <w:rStyle w:val="Heading2Char"/>
@@ -24260,6 +24638,7 @@
               </w:rPr>
               <w:t>sc.admin</w:t>
             </w:r>
+            <w:proofErr w:type="spellEnd"/>
           </w:p>
         </w:tc>
         <w:tc>
@@ -24301,6 +24680,7 @@
                 <w:lang w:val="en-US"/>
               </w:rPr>
             </w:pPr>
+            <w:proofErr w:type="spellStart"/>
             <w:r>
               <w:rPr>
                 <w:rStyle w:val="Heading2Char"/>
@@ -24308,6 +24688,7 @@
               </w:rPr>
               <w:t>ScanMIR</w:t>
             </w:r>
+            <w:proofErr w:type="spellEnd"/>
           </w:p>
         </w:tc>
         <w:tc>
@@ -24346,6 +24727,7 @@
                 <w:lang w:val="en-US"/>
               </w:rPr>
             </w:pPr>
+            <w:proofErr w:type="spellStart"/>
             <w:r>
               <w:rPr>
                 <w:rStyle w:val="Heading2Char"/>
@@ -24353,6 +24735,7 @@
               </w:rPr>
               <w:t>sd.admin</w:t>
             </w:r>
+            <w:proofErr w:type="spellEnd"/>
           </w:p>
         </w:tc>
         <w:tc>
@@ -24394,6 +24777,7 @@
                 <w:lang w:val="en-US"/>
               </w:rPr>
             </w:pPr>
+            <w:proofErr w:type="spellStart"/>
             <w:r>
               <w:rPr>
                 <w:rStyle w:val="Heading2Char"/>
@@ -24401,6 +24785,7 @@
               </w:rPr>
               <w:t>shea.vachon</w:t>
             </w:r>
+            <w:proofErr w:type="spellEnd"/>
           </w:p>
         </w:tc>
         <w:tc>
@@ -24439,6 +24824,7 @@
                 <w:lang w:val="en-US"/>
               </w:rPr>
             </w:pPr>
+            <w:proofErr w:type="spellStart"/>
             <w:r>
               <w:rPr>
                 <w:rStyle w:val="Heading2Char"/>
@@ -24446,6 +24832,7 @@
               </w:rPr>
               <w:t>sv.admin</w:t>
             </w:r>
+            <w:proofErr w:type="spellEnd"/>
           </w:p>
         </w:tc>
         <w:tc>
@@ -24532,6 +24919,7 @@
                 <w:lang w:val="en-US"/>
               </w:rPr>
             </w:pPr>
+            <w:proofErr w:type="spellStart"/>
             <w:r>
               <w:rPr>
                 <w:rStyle w:val="Heading2Char"/>
@@ -24539,6 +24927,7 @@
               </w:rPr>
               <w:t>svcSQLVSS</w:t>
             </w:r>
+            <w:proofErr w:type="spellEnd"/>
           </w:p>
         </w:tc>
         <w:tc>
@@ -35551,7 +35940,7 @@
     </w:tblStylePr>
     <w:tblStylePr w:type="band1Horz">
       <w:rPr>
-        <w:rFonts w:ascii="Segoe" w:hAnsi="Segoe"/>
+        <w:rFonts w:ascii="Lucida Grande" w:hAnsi="Lucida Grande"/>
         <w:sz w:val="16"/>
       </w:rPr>
       <w:tblPr/>
@@ -35571,7 +35960,7 @@
     </w:tblStylePr>
     <w:tblStylePr w:type="band2Horz">
       <w:rPr>
-        <w:rFonts w:ascii="Segoe" w:hAnsi="Segoe"/>
+        <w:rFonts w:ascii="Lucida Grande" w:hAnsi="Lucida Grande"/>
         <w:sz w:val="16"/>
       </w:rPr>
       <w:tblPr/>
@@ -36810,6 +37199,16 @@
 </file>
 
 <file path=customXml/item1.xml><?xml version="1.0" encoding="utf-8"?>
+<p:properties xmlns:p="http://schemas.microsoft.com/office/2006/metadata/properties" xmlns:xsi="http://www.w3.org/2001/XMLSchema-instance" xmlns:pc="http://schemas.microsoft.com/office/infopath/2007/PartnerControls">
+  <documentManagement/>
+</p:properties>
+</file>
+
+<file path=customXml/item2.xml><?xml version="1.0" encoding="utf-8"?>
+<b:Sources xmlns:b="http://schemas.openxmlformats.org/officeDocument/2006/bibliography" xmlns="http://schemas.openxmlformats.org/officeDocument/2006/bibliography" SelectedStyle="/APA.XSL" StyleName="APA"/>
+</file>
+
+<file path=customXml/item3.xml><?xml version="1.0" encoding="utf-8"?>
 <?mso-contentType ?>
 <FormTemplates xmlns="http://schemas.microsoft.com/sharepoint/v3/contenttype/forms">
   <Display>DocumentLibraryForm</Display>
@@ -36818,7 +37217,7 @@
 </FormTemplates>
 </file>
 
-<file path=customXml/item2.xml><?xml version="1.0" encoding="utf-8"?>
+<file path=customXml/item4.xml><?xml version="1.0" encoding="utf-8"?>
 <ct:contentTypeSchema xmlns:ct="http://schemas.microsoft.com/office/2006/metadata/contentType" xmlns:ma="http://schemas.microsoft.com/office/2006/metadata/properties/metaAttributes" ct:_="" ma:_="" ma:contentTypeName="Document" ma:contentTypeID="0x010100E8CB6F3EDD43474AA10481D50BB64020" ma:contentTypeVersion="4" ma:contentTypeDescription="Create a new document." ma:contentTypeScope="" ma:versionID="be0fb91248b2e97ea45459c2c5c0e22c">
   <xsd:schema xmlns:xsd="http://www.w3.org/2001/XMLSchema" xmlns:xs="http://www.w3.org/2001/XMLSchema" xmlns:p="http://schemas.microsoft.com/office/2006/metadata/properties" xmlns:ns2="564344db-7381-46cc-ad20-5587031b0ed9" targetNamespace="http://schemas.microsoft.com/office/2006/metadata/properties" ma:root="true" ma:fieldsID="9b3be8367740804d7b19f678bfda6a23" ns2:_="">
     <xsd:import namespace="564344db-7381-46cc-ad20-5587031b0ed9"/>
@@ -36962,17 +37361,24 @@
 </ct:contentTypeSchema>
 </file>
 
-<file path=customXml/item3.xml><?xml version="1.0" encoding="utf-8"?>
-<p:properties xmlns:p="http://schemas.microsoft.com/office/2006/metadata/properties" xmlns:xsi="http://www.w3.org/2001/XMLSchema-instance" xmlns:pc="http://schemas.microsoft.com/office/infopath/2007/PartnerControls">
-  <documentManagement/>
-</p:properties>
+<file path=customXml/itemProps1.xml><?xml version="1.0" encoding="utf-8"?>
+<ds:datastoreItem xmlns:ds="http://schemas.openxmlformats.org/officeDocument/2006/customXml" ds:itemID="{EEF0FF5E-EC80-4EC7-816E-8FD3FB1F00C5}">
+  <ds:schemaRefs>
+    <ds:schemaRef ds:uri="http://schemas.microsoft.com/office/2006/metadata/properties"/>
+    <ds:schemaRef ds:uri="http://schemas.microsoft.com/office/infopath/2007/PartnerControls"/>
+  </ds:schemaRefs>
+</ds:datastoreItem>
 </file>
 
-<file path=customXml/item4.xml><?xml version="1.0" encoding="utf-8"?>
-<b:Sources xmlns:b="http://schemas.openxmlformats.org/officeDocument/2006/bibliography" xmlns="http://schemas.openxmlformats.org/officeDocument/2006/bibliography" SelectedStyle="/APA.XSL" StyleName="APA"/>
+<file path=customXml/itemProps2.xml><?xml version="1.0" encoding="utf-8"?>
+<ds:datastoreItem xmlns:ds="http://schemas.openxmlformats.org/officeDocument/2006/customXml" ds:itemID="{1F2F4FAC-1BAA-4C15-8BEC-869F6AC26C67}">
+  <ds:schemaRefs>
+    <ds:schemaRef ds:uri="http://schemas.openxmlformats.org/officeDocument/2006/bibliography"/>
+  </ds:schemaRefs>
+</ds:datastoreItem>
 </file>
 
-<file path=customXml/itemProps1.xml><?xml version="1.0" encoding="utf-8"?>
+<file path=customXml/itemProps3.xml><?xml version="1.0" encoding="utf-8"?>
 <ds:datastoreItem xmlns:ds="http://schemas.openxmlformats.org/officeDocument/2006/customXml" ds:itemID="{6830A3BC-7801-49DF-97A3-727FA35DA724}">
   <ds:schemaRefs>
     <ds:schemaRef ds:uri="http://schemas.microsoft.com/sharepoint/v3/contenttype/forms"/>
@@ -36980,7 +37386,7 @@
 </ds:datastoreItem>
 </file>
 
-<file path=customXml/itemProps2.xml><?xml version="1.0" encoding="utf-8"?>
+<file path=customXml/itemProps4.xml><?xml version="1.0" encoding="utf-8"?>
 <ds:datastoreItem xmlns:ds="http://schemas.openxmlformats.org/officeDocument/2006/customXml" ds:itemID="{EC30F5FF-22C8-4A05-8DCE-BA118E3692D7}">
   <ds:schemaRefs>
     <ds:schemaRef ds:uri="http://schemas.microsoft.com/office/2006/metadata/contentType"/>
@@ -36996,21 +37402,4 @@
     <ds:schemaRef ds:uri="http://schemas.microsoft.com/internal/obd"/>
   </ds:schemaRefs>
 </ds:datastoreItem>
-</file>
-
-<file path=customXml/itemProps3.xml><?xml version="1.0" encoding="utf-8"?>
-<ds:datastoreItem xmlns:ds="http://schemas.openxmlformats.org/officeDocument/2006/customXml" ds:itemID="{EEF0FF5E-EC80-4EC7-816E-8FD3FB1F00C5}">
-  <ds:schemaRefs>
-    <ds:schemaRef ds:uri="http://schemas.microsoft.com/office/2006/metadata/properties"/>
-    <ds:schemaRef ds:uri="http://schemas.microsoft.com/office/infopath/2007/PartnerControls"/>
-  </ds:schemaRefs>
-</ds:datastoreItem>
-</file>
-
-<file path=customXml/itemProps4.xml><?xml version="1.0" encoding="utf-8"?>
-<ds:datastoreItem xmlns:ds="http://schemas.openxmlformats.org/officeDocument/2006/customXml" ds:itemID="{1F2F4FAC-1BAA-4C15-8BEC-869F6AC26C67}">
-  <ds:schemaRefs>
-    <ds:schemaRef ds:uri="http://schemas.openxmlformats.org/officeDocument/2006/bibliography"/>
-  </ds:schemaRefs>
-</ds:datastoreItem>
 </file>
</xml_diff>

<commit_message>
CRITICAL FIX: Add-AdDomainInformation was missing rowIndex++ causing empty table - now fully populates all 21 metrics
</commit_message>
<xml_diff>
--- a/output/assessments/MyAssessment.docx
+++ b/output/assessments/MyAssessment.docx
@@ -124,6 +124,7 @@
                               </w:rPr>
                               <w:t>N</w:t>
                             </w:r>
+                            <w:proofErr w:type="spellStart"/>
                             <w:r>
                               <w:rPr>
                                 <w:rFonts w:eastAsiaTheme="majorEastAsia" w:cstheme="majorBidi"/>
@@ -136,6 +137,7 @@
                               </w:rPr>
                               <w:t>ame</w:t>
                             </w:r>
+                            <w:proofErr w:type="spellEnd"/>
                             <w:r>
                               <w:rPr>
                                 <w:rFonts w:eastAsiaTheme="majorEastAsia" w:cstheme="majorBidi"/>
@@ -7759,18 +7761,41 @@
     </w:p>
     <w:p>
       <w:pPr>
-        <w:pStyle w:val="Caption"/>
         <w:rPr>
           <w:lang w:val="en-US"/>
         </w:rPr>
       </w:pPr>
       <w:bookmarkStart w:id="23" w:name="BK_AD_Domain_Information_Table"/>
       <w:bookmarkEnd w:id="23"/>
-      <w:r>
+    </w:p>
+    <w:p>
+      <w:pPr>
         <w:rPr>
           <w:lang w:val="en-US"/>
         </w:rPr>
-        <w:t>Domain Summary</w:t>
+      </w:pPr>
+    </w:p>
+    <w:p>
+      <w:pPr>
+        <w:rPr>
+          <w:lang w:val="en-US"/>
+        </w:rPr>
+      </w:pPr>
+    </w:p>
+    <w:p>
+      <w:pPr>
+        <w:pStyle w:val="Caption"/>
+        <w:rPr>
+          <w:lang w:val="en-US"/>
+        </w:rPr>
+      </w:pPr>
+      <w:bookmarkStart w:id="24" w:name="BK_Domain_Discovery_Table"/>
+      <w:bookmarkEnd w:id="24"/>
+      <w:r>
+        <w:rPr>
+          <w:lang w:val="en-US"/>
+        </w:rPr>
+        <w:t>Domain Discovery Summary</w:t>
       </w:r>
     </w:p>
     <w:tbl>
@@ -7780,8 +7805,8 @@
         <w:tblLook w:val="04A0" w:firstRow="1" w:lastRow="0" w:firstColumn="1" w:lastColumn="0" w:noHBand="0" w:noVBand="1"/>
       </w:tblPr>
       <w:tblGrid>
-        <w:gridCol w:w="2062"/>
-        <w:gridCol w:w="4407"/>
+        <w:gridCol w:w="1517"/>
+        <w:gridCol w:w="2074"/>
       </w:tblGrid>
       <w:tr>
         <w:trPr>
@@ -7842,29 +7867,31 @@
                 <w:lang w:val="en-US"/>
               </w:rPr>
             </w:pPr>
-            <w:r>
-              <w:rPr>
-                <w:lang w:val="en-US"/>
-              </w:rPr>
-              <w:t>Domain FQDN</w:t>
-            </w:r>
-          </w:p>
-        </w:tc>
-        <w:tc>
-          <w:tcPr>
-            <w:tcW w:w="0" w:type="auto"/>
-          </w:tcPr>
-          <w:p>
-            <w:pPr>
-              <w:rPr>
-                <w:lang w:val="en-US"/>
-              </w:rPr>
-            </w:pPr>
-            <w:r>
-              <w:rPr>
-                <w:lang w:val="en-US"/>
-              </w:rPr>
-              <w:t>corp.voyageurtransportation.ca</w:t>
+            <w:proofErr w:type="spellStart"/>
+            <w:r>
+              <w:rPr>
+                <w:lang w:val="en-US"/>
+              </w:rPr>
+              <w:t>DiscoveryDate</w:t>
+            </w:r>
+            <w:proofErr w:type="spellEnd"/>
+          </w:p>
+        </w:tc>
+        <w:tc>
+          <w:tcPr>
+            <w:tcW w:w="0" w:type="auto"/>
+          </w:tcPr>
+          <w:p>
+            <w:pPr>
+              <w:rPr>
+                <w:lang w:val="en-US"/>
+              </w:rPr>
+            </w:pPr>
+            <w:r>
+              <w:rPr>
+                <w:lang w:val="en-US"/>
+              </w:rPr>
+              <w:t>2026-01-30 14:31:04</w:t>
             </w:r>
           </w:p>
         </w:tc>
@@ -7886,30 +7913,18 @@
                 <w:lang w:val="en-US"/>
               </w:rPr>
             </w:pPr>
-            <w:r>
-              <w:rPr>
-                <w:lang w:val="en-US"/>
-              </w:rPr>
-              <w:t>NetBIOS Name</w:t>
-            </w:r>
-          </w:p>
-        </w:tc>
-        <w:tc>
-          <w:tcPr>
-            <w:tcW w:w="0" w:type="auto"/>
-          </w:tcPr>
-          <w:p>
-            <w:pPr>
-              <w:rPr>
-                <w:lang w:val="en-US"/>
-              </w:rPr>
-            </w:pPr>
-            <w:r>
-              <w:rPr>
-                <w:lang w:val="en-US"/>
-              </w:rPr>
-              <w:t>VTS</w:t>
-            </w:r>
+          </w:p>
+        </w:tc>
+        <w:tc>
+          <w:tcPr>
+            <w:tcW w:w="0" w:type="auto"/>
+          </w:tcPr>
+          <w:p>
+            <w:pPr>
+              <w:rPr>
+                <w:lang w:val="en-US"/>
+              </w:rPr>
+            </w:pPr>
           </w:p>
         </w:tc>
       </w:tr>
@@ -7927,30 +7942,18 @@
                 <w:lang w:val="en-US"/>
               </w:rPr>
             </w:pPr>
-            <w:r>
-              <w:rPr>
-                <w:lang w:val="en-US"/>
-              </w:rPr>
-              <w:t>Domain Mode</w:t>
-            </w:r>
-          </w:p>
-        </w:tc>
-        <w:tc>
-          <w:tcPr>
-            <w:tcW w:w="0" w:type="auto"/>
-          </w:tcPr>
-          <w:p>
-            <w:pPr>
-              <w:rPr>
-                <w:lang w:val="en-US"/>
-              </w:rPr>
-            </w:pPr>
-            <w:r>
-              <w:rPr>
-                <w:lang w:val="en-US"/>
-              </w:rPr>
-              <w:t>Windows2016Domain</w:t>
-            </w:r>
+          </w:p>
+        </w:tc>
+        <w:tc>
+          <w:tcPr>
+            <w:tcW w:w="0" w:type="auto"/>
+          </w:tcPr>
+          <w:p>
+            <w:pPr>
+              <w:rPr>
+                <w:lang w:val="en-US"/>
+              </w:rPr>
+            </w:pPr>
           </w:p>
         </w:tc>
       </w:tr>
@@ -7971,30 +7974,18 @@
                 <w:lang w:val="en-US"/>
               </w:rPr>
             </w:pPr>
-            <w:r>
-              <w:rPr>
-                <w:lang w:val="en-US"/>
-              </w:rPr>
-              <w:t>PDC Emulator</w:t>
-            </w:r>
-          </w:p>
-        </w:tc>
-        <w:tc>
-          <w:tcPr>
-            <w:tcW w:w="0" w:type="auto"/>
-          </w:tcPr>
-          <w:p>
-            <w:pPr>
-              <w:rPr>
-                <w:lang w:val="en-US"/>
-              </w:rPr>
-            </w:pPr>
-            <w:r>
-              <w:rPr>
-                <w:lang w:val="en-US"/>
-              </w:rPr>
-              <w:t>LONROGDC05.corp.voyageurtransportation.ca</w:t>
-            </w:r>
+          </w:p>
+        </w:tc>
+        <w:tc>
+          <w:tcPr>
+            <w:tcW w:w="0" w:type="auto"/>
+          </w:tcPr>
+          <w:p>
+            <w:pPr>
+              <w:rPr>
+                <w:lang w:val="en-US"/>
+              </w:rPr>
+            </w:pPr>
           </w:p>
         </w:tc>
       </w:tr>
@@ -8012,30 +8003,18 @@
                 <w:lang w:val="en-US"/>
               </w:rPr>
             </w:pPr>
-            <w:r>
-              <w:rPr>
-                <w:lang w:val="en-US"/>
-              </w:rPr>
-              <w:t>RID Master</w:t>
-            </w:r>
-          </w:p>
-        </w:tc>
-        <w:tc>
-          <w:tcPr>
-            <w:tcW w:w="0" w:type="auto"/>
-          </w:tcPr>
-          <w:p>
-            <w:pPr>
-              <w:rPr>
-                <w:lang w:val="en-US"/>
-              </w:rPr>
-            </w:pPr>
-            <w:r>
-              <w:rPr>
-                <w:lang w:val="en-US"/>
-              </w:rPr>
-              <w:t>LONROGDC05.corp.voyageurtransportation.ca</w:t>
-            </w:r>
+          </w:p>
+        </w:tc>
+        <w:tc>
+          <w:tcPr>
+            <w:tcW w:w="0" w:type="auto"/>
+          </w:tcPr>
+          <w:p>
+            <w:pPr>
+              <w:rPr>
+                <w:lang w:val="en-US"/>
+              </w:rPr>
+            </w:pPr>
           </w:p>
         </w:tc>
       </w:tr>
@@ -8056,194 +8035,18 @@
                 <w:lang w:val="en-US"/>
               </w:rPr>
             </w:pPr>
-            <w:r>
-              <w:rPr>
-                <w:lang w:val="en-US"/>
-              </w:rPr>
-              <w:t>Infrastructure Master</w:t>
-            </w:r>
-          </w:p>
-        </w:tc>
-        <w:tc>
-          <w:tcPr>
-            <w:tcW w:w="0" w:type="auto"/>
-          </w:tcPr>
-          <w:p>
-            <w:pPr>
-              <w:rPr>
-                <w:lang w:val="en-US"/>
-              </w:rPr>
-            </w:pPr>
-            <w:r>
-              <w:rPr>
-                <w:lang w:val="en-US"/>
-              </w:rPr>
-              <w:t>LONROGDC05.corp.voyageurtransportation.ca</w:t>
-            </w:r>
-          </w:p>
-        </w:tc>
-      </w:tr>
-    </w:tbl>
-    <w:p>
-      <w:pPr>
-        <w:rPr>
-          <w:lang w:val="en-US"/>
-        </w:rPr>
-      </w:pPr>
-    </w:p>
-    <w:p>
-      <w:pPr>
-        <w:rPr>
-          <w:lang w:val="en-US"/>
-        </w:rPr>
-      </w:pPr>
-    </w:p>
-    <w:p>
-      <w:pPr>
-        <w:rPr>
-          <w:lang w:val="en-US"/>
-        </w:rPr>
-      </w:pPr>
-    </w:p>
-    <w:p>
-      <w:pPr>
-        <w:rPr>
-          <w:lang w:val="en-US"/>
-        </w:rPr>
-      </w:pPr>
-    </w:p>
-    <w:p>
-      <w:pPr>
-        <w:pStyle w:val="Caption"/>
-        <w:rPr>
-          <w:lang w:val="en-US"/>
-        </w:rPr>
-      </w:pPr>
-      <w:bookmarkStart w:id="24" w:name="BK_Domain_Discovery_Table"/>
-      <w:bookmarkEnd w:id="24"/>
-      <w:r>
-        <w:rPr>
-          <w:lang w:val="en-US"/>
-        </w:rPr>
-        <w:t>Domain Discovery Summary</w:t>
-      </w:r>
-    </w:p>
-    <w:tbl>
-      <w:tblPr>
-        <w:tblStyle w:val="BT-Default"/>
-        <w:tblW w:w="0" w:type="auto"/>
-        <w:tblLook w:val="04A0" w:firstRow="1" w:lastRow="0" w:firstColumn="1" w:lastColumn="0" w:noHBand="0" w:noVBand="1"/>
-      </w:tblPr>
-      <w:tblGrid>
-        <w:gridCol w:w="1537"/>
-        <w:gridCol w:w="1147"/>
-        <w:gridCol w:w="2222"/>
-        <w:gridCol w:w="2222"/>
-        <w:gridCol w:w="2222"/>
-      </w:tblGrid>
-      <w:tr>
-        <w:trPr>
-          <w:cnfStyle w:val="100000000000" w:firstRow="1" w:lastRow="0" w:firstColumn="0" w:lastColumn="0" w:oddVBand="0" w:evenVBand="0" w:oddHBand="0" w:evenHBand="0" w:firstRowFirstColumn="0" w:firstRowLastColumn="0" w:lastRowFirstColumn="0" w:lastRowLastColumn="0"/>
-        </w:trPr>
-        <w:tc>
-          <w:tcPr>
-            <w:tcW w:w="0" w:type="auto"/>
-          </w:tcPr>
-          <w:p>
-            <w:pPr>
-              <w:rPr>
-                <w:color w:val="FFFFFF"/>
-                <w:lang w:val="en-US"/>
-              </w:rPr>
-            </w:pPr>
-            <w:r>
-              <w:rPr>
-                <w:color w:val="FFFFFF"/>
-                <w:lang w:val="en-US"/>
-              </w:rPr>
-              <w:lastRenderedPageBreak/>
-              <w:t>Domain Name</w:t>
-            </w:r>
-          </w:p>
-        </w:tc>
-        <w:tc>
-          <w:tcPr>
-            <w:tcW w:w="0" w:type="auto"/>
-          </w:tcPr>
-          <w:p>
-            <w:pPr>
-              <w:rPr>
-                <w:color w:val="FFFFFF"/>
-                <w:lang w:val="en-US"/>
-              </w:rPr>
-            </w:pPr>
-            <w:r>
-              <w:rPr>
-                <w:color w:val="FFFFFF"/>
-                <w:lang w:val="en-US"/>
-              </w:rPr>
-              <w:t>Functional Level</w:t>
-            </w:r>
-          </w:p>
-        </w:tc>
-        <w:tc>
-          <w:tcPr>
-            <w:tcW w:w="0" w:type="auto"/>
-          </w:tcPr>
-          <w:p>
-            <w:pPr>
-              <w:rPr>
-                <w:color w:val="FFFFFF"/>
-                <w:lang w:val="en-US"/>
-              </w:rPr>
-            </w:pPr>
-            <w:r>
-              <w:rPr>
-                <w:color w:val="FFFFFF"/>
-                <w:lang w:val="en-US"/>
-              </w:rPr>
-              <w:t>PDC Emulator</w:t>
-            </w:r>
-          </w:p>
-        </w:tc>
-        <w:tc>
-          <w:tcPr>
-            <w:tcW w:w="0" w:type="auto"/>
-          </w:tcPr>
-          <w:p>
-            <w:pPr>
-              <w:rPr>
-                <w:color w:val="FFFFFF"/>
-                <w:lang w:val="en-US"/>
-              </w:rPr>
-            </w:pPr>
-            <w:r>
-              <w:rPr>
-                <w:color w:val="FFFFFF"/>
-                <w:lang w:val="en-US"/>
-              </w:rPr>
-              <w:t>RID Master</w:t>
-            </w:r>
-          </w:p>
-        </w:tc>
-        <w:tc>
-          <w:tcPr>
-            <w:tcW w:w="0" w:type="auto"/>
-          </w:tcPr>
-          <w:p>
-            <w:pPr>
-              <w:rPr>
-                <w:color w:val="FFFFFF"/>
-                <w:lang w:val="en-US"/>
-              </w:rPr>
-            </w:pPr>
-            <w:r>
-              <w:rPr>
-                <w:color w:val="FFFFFF"/>
-                <w:lang w:val="en-US"/>
-              </w:rPr>
-              <w:t>Infrastructure Master</w:t>
-            </w:r>
+          </w:p>
+        </w:tc>
+        <w:tc>
+          <w:tcPr>
+            <w:tcW w:w="0" w:type="auto"/>
+          </w:tcPr>
+          <w:p>
+            <w:pPr>
+              <w:rPr>
+                <w:lang w:val="en-US"/>
+              </w:rPr>
+            </w:pPr>
           </w:p>
         </w:tc>
       </w:tr>
@@ -8261,84 +8064,445 @@
                 <w:lang w:val="en-US"/>
               </w:rPr>
             </w:pPr>
-            <w:r>
-              <w:rPr>
-                <w:lang w:val="en-US"/>
-              </w:rPr>
-              <w:t>corp.voyageurtransportation.ca</w:t>
-            </w:r>
-          </w:p>
-        </w:tc>
-        <w:tc>
-          <w:tcPr>
-            <w:tcW w:w="0" w:type="auto"/>
-          </w:tcPr>
-          <w:p>
-            <w:pPr>
-              <w:rPr>
-                <w:lang w:val="en-US"/>
-              </w:rPr>
-            </w:pPr>
-            <w:r>
-              <w:rPr>
-                <w:lang w:val="en-US"/>
-              </w:rPr>
-              <w:t>Windows2016Domain</w:t>
-            </w:r>
-          </w:p>
-        </w:tc>
-        <w:tc>
-          <w:tcPr>
-            <w:tcW w:w="0" w:type="auto"/>
-          </w:tcPr>
-          <w:p>
-            <w:pPr>
-              <w:rPr>
-                <w:lang w:val="en-US"/>
-              </w:rPr>
-            </w:pPr>
-            <w:r>
-              <w:rPr>
-                <w:lang w:val="en-US"/>
-              </w:rPr>
-              <w:t>LONROGDC05.corp.voyageurtransportation.ca</w:t>
-            </w:r>
-          </w:p>
-        </w:tc>
-        <w:tc>
-          <w:tcPr>
-            <w:tcW w:w="0" w:type="auto"/>
-          </w:tcPr>
-          <w:p>
-            <w:pPr>
-              <w:rPr>
-                <w:lang w:val="en-US"/>
-              </w:rPr>
-            </w:pPr>
-            <w:r>
-              <w:rPr>
-                <w:lang w:val="en-US"/>
-              </w:rPr>
-              <w:t>LONROGDC05.corp.voyageurtransportation.ca</w:t>
-            </w:r>
-          </w:p>
-        </w:tc>
-        <w:tc>
-          <w:tcPr>
-            <w:tcW w:w="0" w:type="auto"/>
-          </w:tcPr>
-          <w:p>
-            <w:pPr>
-              <w:rPr>
-                <w:lang w:val="en-US"/>
-              </w:rPr>
-            </w:pPr>
-            <w:r>
-              <w:rPr>
-                <w:lang w:val="en-US"/>
-              </w:rPr>
-              <w:t>LONROGDC05.corp.voyageurtransportation.ca</w:t>
-            </w:r>
+          </w:p>
+        </w:tc>
+        <w:tc>
+          <w:tcPr>
+            <w:tcW w:w="0" w:type="auto"/>
+          </w:tcPr>
+          <w:p>
+            <w:pPr>
+              <w:rPr>
+                <w:lang w:val="en-US"/>
+              </w:rPr>
+            </w:pPr>
+          </w:p>
+        </w:tc>
+      </w:tr>
+      <w:tr>
+        <w:tblPrEx>
+          <w:jc w:val="left"/>
+        </w:tblPrEx>
+        <w:trPr>
+          <w:cnfStyle w:val="000000010000" w:firstRow="0" w:lastRow="0" w:firstColumn="0" w:lastColumn="0" w:oddVBand="0" w:evenVBand="0" w:oddHBand="0" w:evenHBand="1" w:firstRowFirstColumn="0" w:firstRowLastColumn="0" w:lastRowFirstColumn="0" w:lastRowLastColumn="0"/>
+        </w:trPr>
+        <w:tc>
+          <w:tcPr>
+            <w:tcW w:w="0" w:type="auto"/>
+          </w:tcPr>
+          <w:p>
+            <w:pPr>
+              <w:rPr>
+                <w:lang w:val="en-US"/>
+              </w:rPr>
+            </w:pPr>
+          </w:p>
+        </w:tc>
+        <w:tc>
+          <w:tcPr>
+            <w:tcW w:w="0" w:type="auto"/>
+          </w:tcPr>
+          <w:p>
+            <w:pPr>
+              <w:rPr>
+                <w:lang w:val="en-US"/>
+              </w:rPr>
+            </w:pPr>
+          </w:p>
+        </w:tc>
+      </w:tr>
+      <w:tr>
+        <w:tblPrEx>
+          <w:jc w:val="left"/>
+        </w:tblPrEx>
+        <w:tc>
+          <w:tcPr>
+            <w:tcW w:w="0" w:type="auto"/>
+          </w:tcPr>
+          <w:p>
+            <w:pPr>
+              <w:rPr>
+                <w:lang w:val="en-US"/>
+              </w:rPr>
+            </w:pPr>
+          </w:p>
+        </w:tc>
+        <w:tc>
+          <w:tcPr>
+            <w:tcW w:w="0" w:type="auto"/>
+          </w:tcPr>
+          <w:p>
+            <w:pPr>
+              <w:rPr>
+                <w:lang w:val="en-US"/>
+              </w:rPr>
+            </w:pPr>
+          </w:p>
+        </w:tc>
+      </w:tr>
+      <w:tr>
+        <w:tblPrEx>
+          <w:jc w:val="left"/>
+        </w:tblPrEx>
+        <w:trPr>
+          <w:cnfStyle w:val="000000010000" w:firstRow="0" w:lastRow="0" w:firstColumn="0" w:lastColumn="0" w:oddVBand="0" w:evenVBand="0" w:oddHBand="0" w:evenHBand="1" w:firstRowFirstColumn="0" w:firstRowLastColumn="0" w:lastRowFirstColumn="0" w:lastRowLastColumn="0"/>
+        </w:trPr>
+        <w:tc>
+          <w:tcPr>
+            <w:tcW w:w="0" w:type="auto"/>
+          </w:tcPr>
+          <w:p>
+            <w:pPr>
+              <w:rPr>
+                <w:lang w:val="en-US"/>
+              </w:rPr>
+            </w:pPr>
+          </w:p>
+        </w:tc>
+        <w:tc>
+          <w:tcPr>
+            <w:tcW w:w="0" w:type="auto"/>
+          </w:tcPr>
+          <w:p>
+            <w:pPr>
+              <w:rPr>
+                <w:lang w:val="en-US"/>
+              </w:rPr>
+            </w:pPr>
+          </w:p>
+        </w:tc>
+      </w:tr>
+      <w:tr>
+        <w:tblPrEx>
+          <w:jc w:val="left"/>
+        </w:tblPrEx>
+        <w:tc>
+          <w:tcPr>
+            <w:tcW w:w="0" w:type="auto"/>
+          </w:tcPr>
+          <w:p>
+            <w:pPr>
+              <w:rPr>
+                <w:lang w:val="en-US"/>
+              </w:rPr>
+            </w:pPr>
+          </w:p>
+        </w:tc>
+        <w:tc>
+          <w:tcPr>
+            <w:tcW w:w="0" w:type="auto"/>
+          </w:tcPr>
+          <w:p>
+            <w:pPr>
+              <w:rPr>
+                <w:lang w:val="en-US"/>
+              </w:rPr>
+            </w:pPr>
+          </w:p>
+        </w:tc>
+      </w:tr>
+      <w:tr>
+        <w:tblPrEx>
+          <w:jc w:val="left"/>
+        </w:tblPrEx>
+        <w:trPr>
+          <w:cnfStyle w:val="000000010000" w:firstRow="0" w:lastRow="0" w:firstColumn="0" w:lastColumn="0" w:oddVBand="0" w:evenVBand="0" w:oddHBand="0" w:evenHBand="1" w:firstRowFirstColumn="0" w:firstRowLastColumn="0" w:lastRowFirstColumn="0" w:lastRowLastColumn="0"/>
+        </w:trPr>
+        <w:tc>
+          <w:tcPr>
+            <w:tcW w:w="0" w:type="auto"/>
+          </w:tcPr>
+          <w:p>
+            <w:pPr>
+              <w:rPr>
+                <w:lang w:val="en-US"/>
+              </w:rPr>
+            </w:pPr>
+          </w:p>
+        </w:tc>
+        <w:tc>
+          <w:tcPr>
+            <w:tcW w:w="0" w:type="auto"/>
+          </w:tcPr>
+          <w:p>
+            <w:pPr>
+              <w:rPr>
+                <w:lang w:val="en-US"/>
+              </w:rPr>
+            </w:pPr>
+          </w:p>
+        </w:tc>
+      </w:tr>
+      <w:tr>
+        <w:tblPrEx>
+          <w:jc w:val="left"/>
+        </w:tblPrEx>
+        <w:tc>
+          <w:tcPr>
+            <w:tcW w:w="0" w:type="auto"/>
+          </w:tcPr>
+          <w:p>
+            <w:pPr>
+              <w:rPr>
+                <w:lang w:val="en-US"/>
+              </w:rPr>
+            </w:pPr>
+          </w:p>
+        </w:tc>
+        <w:tc>
+          <w:tcPr>
+            <w:tcW w:w="0" w:type="auto"/>
+          </w:tcPr>
+          <w:p>
+            <w:pPr>
+              <w:rPr>
+                <w:lang w:val="en-US"/>
+              </w:rPr>
+            </w:pPr>
+          </w:p>
+        </w:tc>
+      </w:tr>
+      <w:tr>
+        <w:tblPrEx>
+          <w:jc w:val="left"/>
+        </w:tblPrEx>
+        <w:trPr>
+          <w:cnfStyle w:val="000000010000" w:firstRow="0" w:lastRow="0" w:firstColumn="0" w:lastColumn="0" w:oddVBand="0" w:evenVBand="0" w:oddHBand="0" w:evenHBand="1" w:firstRowFirstColumn="0" w:firstRowLastColumn="0" w:lastRowFirstColumn="0" w:lastRowLastColumn="0"/>
+        </w:trPr>
+        <w:tc>
+          <w:tcPr>
+            <w:tcW w:w="0" w:type="auto"/>
+          </w:tcPr>
+          <w:p>
+            <w:pPr>
+              <w:rPr>
+                <w:lang w:val="en-US"/>
+              </w:rPr>
+            </w:pPr>
+          </w:p>
+        </w:tc>
+        <w:tc>
+          <w:tcPr>
+            <w:tcW w:w="0" w:type="auto"/>
+          </w:tcPr>
+          <w:p>
+            <w:pPr>
+              <w:rPr>
+                <w:lang w:val="en-US"/>
+              </w:rPr>
+            </w:pPr>
+          </w:p>
+        </w:tc>
+      </w:tr>
+      <w:tr>
+        <w:tblPrEx>
+          <w:jc w:val="left"/>
+        </w:tblPrEx>
+        <w:tc>
+          <w:tcPr>
+            <w:tcW w:w="0" w:type="auto"/>
+          </w:tcPr>
+          <w:p>
+            <w:pPr>
+              <w:rPr>
+                <w:lang w:val="en-US"/>
+              </w:rPr>
+            </w:pPr>
+          </w:p>
+        </w:tc>
+        <w:tc>
+          <w:tcPr>
+            <w:tcW w:w="0" w:type="auto"/>
+          </w:tcPr>
+          <w:p>
+            <w:pPr>
+              <w:rPr>
+                <w:lang w:val="en-US"/>
+              </w:rPr>
+            </w:pPr>
+          </w:p>
+        </w:tc>
+      </w:tr>
+      <w:tr>
+        <w:tblPrEx>
+          <w:jc w:val="left"/>
+        </w:tblPrEx>
+        <w:trPr>
+          <w:cnfStyle w:val="000000010000" w:firstRow="0" w:lastRow="0" w:firstColumn="0" w:lastColumn="0" w:oddVBand="0" w:evenVBand="0" w:oddHBand="0" w:evenHBand="1" w:firstRowFirstColumn="0" w:firstRowLastColumn="0" w:lastRowFirstColumn="0" w:lastRowLastColumn="0"/>
+        </w:trPr>
+        <w:tc>
+          <w:tcPr>
+            <w:tcW w:w="0" w:type="auto"/>
+          </w:tcPr>
+          <w:p>
+            <w:pPr>
+              <w:rPr>
+                <w:lang w:val="en-US"/>
+              </w:rPr>
+            </w:pPr>
+          </w:p>
+        </w:tc>
+        <w:tc>
+          <w:tcPr>
+            <w:tcW w:w="0" w:type="auto"/>
+          </w:tcPr>
+          <w:p>
+            <w:pPr>
+              <w:rPr>
+                <w:lang w:val="en-US"/>
+              </w:rPr>
+            </w:pPr>
+          </w:p>
+        </w:tc>
+      </w:tr>
+      <w:tr>
+        <w:tblPrEx>
+          <w:jc w:val="left"/>
+        </w:tblPrEx>
+        <w:tc>
+          <w:tcPr>
+            <w:tcW w:w="0" w:type="auto"/>
+          </w:tcPr>
+          <w:p>
+            <w:pPr>
+              <w:rPr>
+                <w:lang w:val="en-US"/>
+              </w:rPr>
+            </w:pPr>
+          </w:p>
+        </w:tc>
+        <w:tc>
+          <w:tcPr>
+            <w:tcW w:w="0" w:type="auto"/>
+          </w:tcPr>
+          <w:p>
+            <w:pPr>
+              <w:rPr>
+                <w:lang w:val="en-US"/>
+              </w:rPr>
+            </w:pPr>
+          </w:p>
+        </w:tc>
+      </w:tr>
+      <w:tr>
+        <w:tblPrEx>
+          <w:jc w:val="left"/>
+        </w:tblPrEx>
+        <w:trPr>
+          <w:cnfStyle w:val="000000010000" w:firstRow="0" w:lastRow="0" w:firstColumn="0" w:lastColumn="0" w:oddVBand="0" w:evenVBand="0" w:oddHBand="0" w:evenHBand="1" w:firstRowFirstColumn="0" w:firstRowLastColumn="0" w:lastRowFirstColumn="0" w:lastRowLastColumn="0"/>
+        </w:trPr>
+        <w:tc>
+          <w:tcPr>
+            <w:tcW w:w="0" w:type="auto"/>
+          </w:tcPr>
+          <w:p>
+            <w:pPr>
+              <w:rPr>
+                <w:lang w:val="en-US"/>
+              </w:rPr>
+            </w:pPr>
+          </w:p>
+        </w:tc>
+        <w:tc>
+          <w:tcPr>
+            <w:tcW w:w="0" w:type="auto"/>
+          </w:tcPr>
+          <w:p>
+            <w:pPr>
+              <w:rPr>
+                <w:lang w:val="en-US"/>
+              </w:rPr>
+            </w:pPr>
+          </w:p>
+        </w:tc>
+      </w:tr>
+      <w:tr>
+        <w:tblPrEx>
+          <w:jc w:val="left"/>
+        </w:tblPrEx>
+        <w:tc>
+          <w:tcPr>
+            <w:tcW w:w="0" w:type="auto"/>
+          </w:tcPr>
+          <w:p>
+            <w:pPr>
+              <w:rPr>
+                <w:lang w:val="en-US"/>
+              </w:rPr>
+            </w:pPr>
+          </w:p>
+        </w:tc>
+        <w:tc>
+          <w:tcPr>
+            <w:tcW w:w="0" w:type="auto"/>
+          </w:tcPr>
+          <w:p>
+            <w:pPr>
+              <w:rPr>
+                <w:lang w:val="en-US"/>
+              </w:rPr>
+            </w:pPr>
+          </w:p>
+        </w:tc>
+      </w:tr>
+      <w:tr>
+        <w:tblPrEx>
+          <w:jc w:val="left"/>
+        </w:tblPrEx>
+        <w:trPr>
+          <w:cnfStyle w:val="000000010000" w:firstRow="0" w:lastRow="0" w:firstColumn="0" w:lastColumn="0" w:oddVBand="0" w:evenVBand="0" w:oddHBand="0" w:evenHBand="1" w:firstRowFirstColumn="0" w:firstRowLastColumn="0" w:lastRowFirstColumn="0" w:lastRowLastColumn="0"/>
+        </w:trPr>
+        <w:tc>
+          <w:tcPr>
+            <w:tcW w:w="0" w:type="auto"/>
+          </w:tcPr>
+          <w:p>
+            <w:pPr>
+              <w:rPr>
+                <w:lang w:val="en-US"/>
+              </w:rPr>
+            </w:pPr>
+          </w:p>
+        </w:tc>
+        <w:tc>
+          <w:tcPr>
+            <w:tcW w:w="0" w:type="auto"/>
+          </w:tcPr>
+          <w:p>
+            <w:pPr>
+              <w:rPr>
+                <w:lang w:val="en-US"/>
+              </w:rPr>
+            </w:pPr>
+          </w:p>
+        </w:tc>
+      </w:tr>
+      <w:tr>
+        <w:tblPrEx>
+          <w:jc w:val="left"/>
+        </w:tblPrEx>
+        <w:tc>
+          <w:tcPr>
+            <w:tcW w:w="0" w:type="auto"/>
+          </w:tcPr>
+          <w:p>
+            <w:pPr>
+              <w:rPr>
+                <w:lang w:val="en-US"/>
+              </w:rPr>
+            </w:pPr>
+          </w:p>
+        </w:tc>
+        <w:tc>
+          <w:tcPr>
+            <w:tcW w:w="0" w:type="auto"/>
+          </w:tcPr>
+          <w:p>
+            <w:pPr>
+              <w:rPr>
+                <w:lang w:val="en-US"/>
+              </w:rPr>
+            </w:pPr>
           </w:p>
         </w:tc>
       </w:tr>
@@ -9634,7 +9798,14 @@
               <w:rPr>
                 <w:lang w:val="en-US"/>
               </w:rPr>
-              <w:t>voyageurtransportation,DC</w:t>
+              <w:t>voyage</w:t>
+            </w:r>
+            <w:r>
+              <w:rPr>
+                <w:lang w:val="en-US"/>
+              </w:rPr>
+              <w:lastRenderedPageBreak/>
+              <w:t>urtransportation,DC</w:t>
             </w:r>
             <w:proofErr w:type="gramEnd"/>
             <w:r>
@@ -9748,6 +9919,7 @@
               <w:rPr>
                 <w:lang w:val="en-US"/>
               </w:rPr>
+              <w:lastRenderedPageBreak/>
               <w:t>voyageurtransportation,DC</w:t>
             </w:r>
             <w:proofErr w:type="gramEnd"/>
@@ -9885,14 +10057,7 @@
               <w:rPr>
                 <w:lang w:val="en-US"/>
               </w:rPr>
-              <w:t>voyage</w:t>
-            </w:r>
-            <w:r>
-              <w:rPr>
-                <w:lang w:val="en-US"/>
-              </w:rPr>
-              <w:lastRenderedPageBreak/>
-              <w:t>urtransportation,DC</w:t>
+              <w:t>voyageurtransportation,DC</w:t>
             </w:r>
             <w:proofErr w:type="gramEnd"/>
             <w:r>
@@ -10006,7 +10171,6 @@
               <w:rPr>
                 <w:lang w:val="en-US"/>
               </w:rPr>
-              <w:lastRenderedPageBreak/>
               <w:t>voyageurtransportation,DC</w:t>
             </w:r>
             <w:proofErr w:type="gramEnd"/>
@@ -11815,7 +11979,14 @@
               <w:rPr>
                 <w:lang w:val="en-US"/>
               </w:rPr>
-              <w:t>voyageurtransportation,DC</w:t>
+              <w:t>voyage</w:t>
+            </w:r>
+            <w:r>
+              <w:rPr>
+                <w:lang w:val="en-US"/>
+              </w:rPr>
+              <w:lastRenderedPageBreak/>
+              <w:t>urtransportation,DC</w:t>
             </w:r>
             <w:proofErr w:type="gramEnd"/>
             <w:r>
@@ -11929,6 +12100,7 @@
               <w:rPr>
                 <w:lang w:val="en-US"/>
               </w:rPr>
+              <w:lastRenderedPageBreak/>
               <w:t>voyageurtransportation,DC</w:t>
             </w:r>
             <w:proofErr w:type="gramEnd"/>
@@ -12055,14 +12227,7 @@
               <w:rPr>
                 <w:lang w:val="en-US"/>
               </w:rPr>
-              <w:t>voyage</w:t>
-            </w:r>
-            <w:r>
-              <w:rPr>
-                <w:lang w:val="en-US"/>
-              </w:rPr>
-              <w:lastRenderedPageBreak/>
-              <w:t>urtransportation,DC</w:t>
+              <w:t>voyageurtransportation,DC</w:t>
             </w:r>
             <w:proofErr w:type="gramEnd"/>
             <w:r>
@@ -12176,14 +12341,7 @@
               <w:rPr>
                 <w:lang w:val="en-US"/>
               </w:rPr>
-              <w:t>corp,D</w:t>
-            </w:r>
-            <w:r>
-              <w:rPr>
-                <w:lang w:val="en-US"/>
-              </w:rPr>
-              <w:lastRenderedPageBreak/>
-              <w:t>C</w:t>
+              <w:t>corp,DC</w:t>
             </w:r>
             <w:proofErr w:type="gramEnd"/>
             <w:r>
@@ -13991,7 +14149,14 @@
               <w:rPr>
                 <w:lang w:val="en-US"/>
               </w:rPr>
-              <w:t>voyageurtransportation,DC</w:t>
+              <w:t>voyage</w:t>
+            </w:r>
+            <w:r>
+              <w:rPr>
+                <w:lang w:val="en-US"/>
+              </w:rPr>
+              <w:lastRenderedPageBreak/>
+              <w:t>urtransportation,DC</w:t>
             </w:r>
             <w:proofErr w:type="gramEnd"/>
             <w:r>
@@ -14091,7 +14256,14 @@
               <w:rPr>
                 <w:lang w:val="en-US"/>
               </w:rPr>
-              <w:t>corp,DC</w:t>
+              <w:t>corp,</w:t>
+            </w:r>
+            <w:r>
+              <w:rPr>
+                <w:lang w:val="en-US"/>
+              </w:rPr>
+              <w:lastRenderedPageBreak/>
+              <w:t>DC</w:t>
             </w:r>
             <w:proofErr w:type="gramEnd"/>
             <w:r>
@@ -14228,14 +14400,7 @@
               <w:rPr>
                 <w:lang w:val="en-US"/>
               </w:rPr>
-              <w:t>voyage</w:t>
-            </w:r>
-            <w:r>
-              <w:rPr>
-                <w:lang w:val="en-US"/>
-              </w:rPr>
-              <w:lastRenderedPageBreak/>
-              <w:t>urtransportation,DC</w:t>
+              <w:t>voyageurtransportation,DC</w:t>
             </w:r>
             <w:proofErr w:type="gramEnd"/>
             <w:r>
@@ -14335,14 +14500,7 @@
               <w:rPr>
                 <w:lang w:val="en-US"/>
               </w:rPr>
-              <w:t>corp,</w:t>
-            </w:r>
-            <w:r>
-              <w:rPr>
-                <w:lang w:val="en-US"/>
-              </w:rPr>
-              <w:lastRenderedPageBreak/>
-              <w:t>DC</w:t>
+              <w:t>corp,DC</w:t>
             </w:r>
             <w:proofErr w:type="gramEnd"/>
             <w:r>
@@ -16150,7 +16308,14 @@
               <w:rPr>
                 <w:lang w:val="en-US"/>
               </w:rPr>
-              <w:t>voyageurtransportation,DC</w:t>
+              <w:t>voyage</w:t>
+            </w:r>
+            <w:r>
+              <w:rPr>
+                <w:lang w:val="en-US"/>
+              </w:rPr>
+              <w:lastRenderedPageBreak/>
+              <w:t>urtransportation,DC</w:t>
             </w:r>
             <w:proofErr w:type="gramEnd"/>
             <w:r>
@@ -16250,7 +16415,14 @@
               <w:rPr>
                 <w:lang w:val="en-US"/>
               </w:rPr>
-              <w:t>corp,DC</w:t>
+              <w:t>corp,</w:t>
+            </w:r>
+            <w:r>
+              <w:rPr>
+                <w:lang w:val="en-US"/>
+              </w:rPr>
+              <w:lastRenderedPageBreak/>
+              <w:t>DC</w:t>
             </w:r>
             <w:proofErr w:type="gramEnd"/>
             <w:r>
@@ -16390,14 +16562,7 @@
               <w:rPr>
                 <w:lang w:val="en-US"/>
               </w:rPr>
-              <w:t>voyage</w:t>
-            </w:r>
-            <w:r>
-              <w:rPr>
-                <w:lang w:val="en-US"/>
-              </w:rPr>
-              <w:lastRenderedPageBreak/>
-              <w:t>urtransportation,DC</w:t>
+              <w:t>voyageurtransportation,DC</w:t>
             </w:r>
             <w:proofErr w:type="gramEnd"/>
             <w:r>
@@ -16497,14 +16662,7 @@
               <w:rPr>
                 <w:lang w:val="en-US"/>
               </w:rPr>
-              <w:t>corp,</w:t>
-            </w:r>
-            <w:r>
-              <w:rPr>
-                <w:lang w:val="en-US"/>
-              </w:rPr>
-              <w:lastRenderedPageBreak/>
-              <w:t>DC</w:t>
+              <w:t>corp,DC</w:t>
             </w:r>
             <w:proofErr w:type="gramEnd"/>
             <w:r>
@@ -17711,6 +17869,7 @@
               <w:rPr>
                 <w:lang w:val="en-US"/>
               </w:rPr>
+              <w:lastRenderedPageBreak/>
               <w:t>Reversible Encryption Enabled</w:t>
             </w:r>
           </w:p>
@@ -17782,7 +17941,6 @@
         <w:rPr>
           <w:noProof/>
         </w:rPr>
-        <w:lastRenderedPageBreak/>
         <w:t>AD Recycle Bin</w:t>
       </w:r>
       <w:bookmarkEnd w:id="38"/>
@@ -18917,7 +19075,6 @@
               <w:rPr>
                 <w:lang w:val="en-US"/>
               </w:rPr>
-              <w:lastRenderedPageBreak/>
               <w:t>Distribution</w:t>
             </w:r>
           </w:p>
@@ -20192,6 +20349,7 @@
         <w:rPr>
           <w:noProof/>
         </w:rPr>
+        <w:lastRenderedPageBreak/>
         <w:t>Printers</w:t>
       </w:r>
       <w:bookmarkEnd w:id="55"/>
@@ -20353,7 +20511,6 @@
               <w:rPr>
                 <w:lang w:val="en-US"/>
               </w:rPr>
-              <w:lastRenderedPageBreak/>
               <w:t>PRINTSRV-BRANT-MAIN (</w:t>
             </w:r>
             <w:proofErr w:type="spellStart"/>
@@ -21724,6 +21881,7 @@
               <w:rPr>
                 <w:lang w:val="en-US"/>
               </w:rPr>
+              <w:lastRenderedPageBreak/>
               <w:t>PRINTSRV-LDN-ADM-Zebra (</w:t>
             </w:r>
             <w:proofErr w:type="spellStart"/>
@@ -21891,7 +22049,6 @@
               <w:rPr>
                 <w:lang w:val="en-US"/>
               </w:rPr>
-              <w:lastRenderedPageBreak/>
               <w:t>PRINTSRV-LDN-LIB-COYRM (HP Color LaserJet Flow E57540)</w:t>
             </w:r>
           </w:p>
@@ -23164,6 +23321,7 @@
               <w:rPr>
                 <w:lang w:val="en-US"/>
               </w:rPr>
+              <w:lastRenderedPageBreak/>
               <w:t>PRINTSRV-STONEY-86Arvin (HP Color LaserJet MFP E47528)</w:t>
             </w:r>
           </w:p>
@@ -23235,32 +23393,24 @@
               <w:rPr>
                 <w:lang w:val="en-US"/>
               </w:rPr>
-              <w:t xml:space="preserve">PRINTSRV-SUD-DISPATCH (Brother </w:t>
-            </w:r>
-            <w:r>
-              <w:rPr>
-                <w:lang w:val="en-US"/>
-              </w:rPr>
-              <w:lastRenderedPageBreak/>
-              <w:t>MFC-L8900C0298841793</w:t>
-            </w:r>
-          </w:p>
-        </w:tc>
-        <w:tc>
-          <w:tcPr>
-            <w:tcW w:w="0" w:type="auto"/>
-          </w:tcPr>
-          <w:p>
-            <w:pPr>
-              <w:rPr>
-                <w:lang w:val="en-US"/>
-              </w:rPr>
-            </w:pPr>
-            <w:r>
-              <w:rPr>
-                <w:lang w:val="en-US"/>
-              </w:rPr>
-              <w:lastRenderedPageBreak/>
+              <w:t>PRINTSRV-SUD-DISPATCH (Brother MFC-L8900C0298841793</w:t>
+            </w:r>
+          </w:p>
+        </w:tc>
+        <w:tc>
+          <w:tcPr>
+            <w:tcW w:w="0" w:type="auto"/>
+          </w:tcPr>
+          <w:p>
+            <w:pPr>
+              <w:rPr>
+                <w:lang w:val="en-US"/>
+              </w:rPr>
+            </w:pPr>
+            <w:r>
+              <w:rPr>
+                <w:lang w:val="en-US"/>
+              </w:rPr>
               <w:t>PrintSRV.corp.voyageurtransportation.ca</w:t>
             </w:r>
           </w:p>
@@ -24486,6 +24636,7 @@
                 <w:color w:val="FFFFFF"/>
                 <w:lang w:val="en-US"/>
               </w:rPr>
+              <w:lastRenderedPageBreak/>
               <w:t>OU Depth Level</w:t>
             </w:r>
           </w:p>
@@ -24701,7 +24852,6 @@
               <w:rPr>
                 <w:lang w:val="en-US"/>
               </w:rPr>
-              <w:lastRenderedPageBreak/>
               <w:t>6</w:t>
             </w:r>
           </w:p>
@@ -26647,6 +26797,7 @@
               <w:rPr>
                 <w:lang w:val="en-US"/>
               </w:rPr>
+              <w:lastRenderedPageBreak/>
               <w:t>4</w:t>
             </w:r>
           </w:p>
@@ -26863,7 +27014,6 @@
               <w:rPr>
                 <w:lang w:val="en-US"/>
               </w:rPr>
-              <w:lastRenderedPageBreak/>
               <w:t>4</w:t>
             </w:r>
           </w:p>
@@ -28948,6 +29098,7 @@
               <w:rPr>
                 <w:lang w:val="en-US"/>
               </w:rPr>
+              <w:lastRenderedPageBreak/>
               <w:t>2</w:t>
             </w:r>
           </w:p>
@@ -29161,7 +29312,6 @@
               <w:rPr>
                 <w:lang w:val="en-US"/>
               </w:rPr>
-              <w:lastRenderedPageBreak/>
               <w:t>2</w:t>
             </w:r>
           </w:p>
@@ -32442,6 +32592,7 @@
               <w:rPr>
                 <w:lang w:val="en-US"/>
               </w:rPr>
+              <w:lastRenderedPageBreak/>
               <w:t>veeam2qnap</w:t>
             </w:r>
           </w:p>
@@ -32828,7 +32979,6 @@
               <w:rPr>
                 <w:lang w:val="en-US"/>
               </w:rPr>
-              <w:lastRenderedPageBreak/>
               <w:t>mir-scan</w:t>
             </w:r>
           </w:p>
@@ -35867,6 +36017,7 @@
                 <w:rStyle w:val="Heading2Char"/>
                 <w:lang w:val="en-US"/>
               </w:rPr>
+              <w:lastRenderedPageBreak/>
               <w:t>ck.admin</w:t>
             </w:r>
             <w:proofErr w:type="spellEnd"/>
@@ -36063,7 +36214,6 @@
                 <w:rStyle w:val="Heading2Char"/>
                 <w:lang w:val="en-US"/>
               </w:rPr>
-              <w:lastRenderedPageBreak/>
               <w:t>femi.admin</w:t>
             </w:r>
             <w:proofErr w:type="spellEnd"/>
@@ -37324,6 +37474,7 @@
         <w:rPr>
           <w:rStyle w:val="Heading1Char"/>
         </w:rPr>
+        <w:lastRenderedPageBreak/>
         <w:t>Entra</w:t>
       </w:r>
       <w:r>
@@ -37411,7 +37562,6 @@
         <w:rPr>
           <w:rFonts w:cs="Arial"/>
         </w:rPr>
-        <w:lastRenderedPageBreak/>
         <w:t>These user accounts should be reviewed for migration scope.  Chances are a number of these are tied to Stale Accounts.  Stale IDs should be removed to lower the migration scope where possible.</w:t>
       </w:r>
     </w:p>
@@ -37955,6 +38105,7 @@
         <w:rPr>
           <w:rFonts w:cs="Arial"/>
         </w:rPr>
+        <w:lastRenderedPageBreak/>
         <w:t>A</w:t>
       </w:r>
       <w:r>
@@ -38031,7 +38182,6 @@
           <w:b/>
           <w:bCs/>
         </w:rPr>
-        <w:lastRenderedPageBreak/>
         <w:t>Recommendations</w:t>
       </w:r>
       <w:r>
@@ -38523,7 +38673,14 @@
         <w:rPr>
           <w:rFonts w:cs="Arial"/>
         </w:rPr>
-        <w:t>Unlike regular distribution groups that contain a defined set of members, the membership list for dynamic distribution groups is calculated each time a message is sent to the group, based on the filters and conditions that you define. When an email message is sent to a dynamic distribution group, it's delivered to all recipients in the organization that match the criteria defined for that group.</w:t>
+        <w:t xml:space="preserve">Unlike regular distribution groups that contain a defined set of members, the membership list for dynamic distribution groups is calculated each time a message is sent to the group, based on the </w:t>
+      </w:r>
+      <w:r>
+        <w:rPr>
+          <w:rFonts w:cs="Arial"/>
+        </w:rPr>
+        <w:lastRenderedPageBreak/>
+        <w:t>filters and conditions that you define. When an email message is sent to a dynamic distribution group, it's delivered to all recipients in the organization that match the criteria defined for that group.</w:t>
       </w:r>
     </w:p>
     <w:p>
@@ -38561,7 +38718,6 @@
         <w:rPr>
           <w:noProof/>
         </w:rPr>
-        <w:lastRenderedPageBreak/>
         <w:t>Public Folders</w:t>
       </w:r>
       <w:bookmarkEnd w:id="85"/>
@@ -39134,6 +39290,7 @@
           <w:rStyle w:val="Heading1Char"/>
           <w:szCs w:val="36"/>
         </w:rPr>
+        <w:lastRenderedPageBreak/>
         <w:t>Teams Assessment</w:t>
       </w:r>
       <w:bookmarkEnd w:id="93"/>
@@ -39183,7 +39340,6 @@
         <w:rPr>
           <w:noProof/>
         </w:rPr>
-        <w:lastRenderedPageBreak/>
         <w:t>Office 365 groups</w:t>
       </w:r>
       <w:bookmarkEnd w:id="96"/>
@@ -39694,6 +39850,7 @@
           <w:rStyle w:val="Heading1Char"/>
           <w:szCs w:val="36"/>
         </w:rPr>
+        <w:lastRenderedPageBreak/>
         <w:t>Infrastructure Assessment</w:t>
       </w:r>
       <w:bookmarkEnd w:id="103"/>
@@ -39777,7 +39934,6 @@
           <w:rFonts w:cs="Arial"/>
           <w:b/>
         </w:rPr>
-        <w:lastRenderedPageBreak/>
         <w:t>Findings</w:t>
       </w:r>
       <w:r>
@@ -40206,6 +40362,7 @@
           <w:b/>
           <w:bCs/>
         </w:rPr>
+        <w:lastRenderedPageBreak/>
         <w:t>Findings</w:t>
       </w:r>
       <w:r>
@@ -40330,14 +40487,7 @@
         <w:rPr>
           <w:rFonts w:cs="Arial"/>
         </w:rPr>
-        <w:t xml:space="preserve">Wi-Fi connectivity can be initiated in multiple ways.  The typical approaches are: Automatically connect (either at logon or just after), Authenticated after logon, and validated via certificate.  In the first case of automatically connected, the Wi-Fi can be treated the same as a Wired </w:t>
-      </w:r>
-      <w:r>
-        <w:rPr>
-          <w:rFonts w:cs="Arial"/>
-        </w:rPr>
-        <w:lastRenderedPageBreak/>
-        <w:t>connection.  In either of the other two cases a device on Wi-Fi can require additional effort during a migration event.</w:t>
+        <w:t>Wi-Fi connectivity can be initiated in multiple ways.  The typical approaches are: Automatically connect (either at logon or just after), Authenticated after logon, and validated via certificate.  In the first case of automatically connected, the Wi-Fi can be treated the same as a Wired connection.  In either of the other two cases a device on Wi-Fi can require additional effort during a migration event.</w:t>
       </w:r>
     </w:p>
     <w:p>
@@ -49300,12 +49450,6 @@
 </file>
 
 <file path=customXml/item1.xml><?xml version="1.0" encoding="utf-8"?>
-<p:properties xmlns:p="http://schemas.microsoft.com/office/2006/metadata/properties" xmlns:xsi="http://www.w3.org/2001/XMLSchema-instance" xmlns:pc="http://schemas.microsoft.com/office/infopath/2007/PartnerControls">
-  <documentManagement/>
-</p:properties>
-</file>
-
-<file path=customXml/item2.xml><?xml version="1.0" encoding="utf-8"?>
 <ct:contentTypeSchema xmlns:ct="http://schemas.microsoft.com/office/2006/metadata/contentType" xmlns:ma="http://schemas.microsoft.com/office/2006/metadata/properties/metaAttributes" ct:_="" ma:_="" ma:contentTypeName="Document" ma:contentTypeID="0x010100E8CB6F3EDD43474AA10481D50BB64020" ma:contentTypeVersion="4" ma:contentTypeDescription="Create a new document." ma:contentTypeScope="" ma:versionID="be0fb91248b2e97ea45459c2c5c0e22c">
   <xsd:schema xmlns:xsd="http://www.w3.org/2001/XMLSchema" xmlns:xs="http://www.w3.org/2001/XMLSchema" xmlns:p="http://schemas.microsoft.com/office/2006/metadata/properties" xmlns:ns2="564344db-7381-46cc-ad20-5587031b0ed9" targetNamespace="http://schemas.microsoft.com/office/2006/metadata/properties" ma:root="true" ma:fieldsID="9b3be8367740804d7b19f678bfda6a23" ns2:_="">
     <xsd:import namespace="564344db-7381-46cc-ad20-5587031b0ed9"/>
@@ -49449,7 +49593,17 @@
 </ct:contentTypeSchema>
 </file>
 
+<file path=customXml/item2.xml><?xml version="1.0" encoding="utf-8"?>
+<p:properties xmlns:p="http://schemas.microsoft.com/office/2006/metadata/properties" xmlns:xsi="http://www.w3.org/2001/XMLSchema-instance" xmlns:pc="http://schemas.microsoft.com/office/infopath/2007/PartnerControls">
+  <documentManagement/>
+</p:properties>
+</file>
+
 <file path=customXml/item3.xml><?xml version="1.0" encoding="utf-8"?>
+<b:Sources xmlns:b="http://schemas.openxmlformats.org/officeDocument/2006/bibliography" xmlns="http://schemas.openxmlformats.org/officeDocument/2006/bibliography" SelectedStyle="/APA.XSL" StyleName="APA"/>
+</file>
+
+<file path=customXml/item4.xml><?xml version="1.0" encoding="utf-8"?>
 <?mso-contentType ?>
 <FormTemplates xmlns="http://schemas.microsoft.com/sharepoint/v3/contenttype/forms">
   <Display>DocumentLibraryForm</Display>
@@ -49458,20 +49612,7 @@
 </FormTemplates>
 </file>
 
-<file path=customXml/item4.xml><?xml version="1.0" encoding="utf-8"?>
-<b:Sources xmlns:b="http://schemas.openxmlformats.org/officeDocument/2006/bibliography" xmlns="http://schemas.openxmlformats.org/officeDocument/2006/bibliography" SelectedStyle="/APA.XSL" StyleName="APA"/>
-</file>
-
 <file path=customXml/itemProps1.xml><?xml version="1.0" encoding="utf-8"?>
-<ds:datastoreItem xmlns:ds="http://schemas.openxmlformats.org/officeDocument/2006/customXml" ds:itemID="{EEF0FF5E-EC80-4EC7-816E-8FD3FB1F00C5}">
-  <ds:schemaRefs>
-    <ds:schemaRef ds:uri="http://schemas.microsoft.com/office/2006/metadata/properties"/>
-    <ds:schemaRef ds:uri="http://schemas.microsoft.com/office/infopath/2007/PartnerControls"/>
-  </ds:schemaRefs>
-</ds:datastoreItem>
-</file>
-
-<file path=customXml/itemProps2.xml><?xml version="1.0" encoding="utf-8"?>
 <ds:datastoreItem xmlns:ds="http://schemas.openxmlformats.org/officeDocument/2006/customXml" ds:itemID="{EC30F5FF-22C8-4A05-8DCE-BA118E3692D7}">
   <ds:schemaRefs>
     <ds:schemaRef ds:uri="http://schemas.microsoft.com/office/2006/metadata/contentType"/>
@@ -49489,18 +49630,27 @@
 </ds:datastoreItem>
 </file>
 
+<file path=customXml/itemProps2.xml><?xml version="1.0" encoding="utf-8"?>
+<ds:datastoreItem xmlns:ds="http://schemas.openxmlformats.org/officeDocument/2006/customXml" ds:itemID="{EEF0FF5E-EC80-4EC7-816E-8FD3FB1F00C5}">
+  <ds:schemaRefs>
+    <ds:schemaRef ds:uri="http://schemas.microsoft.com/office/2006/metadata/properties"/>
+    <ds:schemaRef ds:uri="http://schemas.microsoft.com/office/infopath/2007/PartnerControls"/>
+  </ds:schemaRefs>
+</ds:datastoreItem>
+</file>
+
 <file path=customXml/itemProps3.xml><?xml version="1.0" encoding="utf-8"?>
+<ds:datastoreItem xmlns:ds="http://schemas.openxmlformats.org/officeDocument/2006/customXml" ds:itemID="{1F2F4FAC-1BAA-4C15-8BEC-869F6AC26C67}">
+  <ds:schemaRefs>
+    <ds:schemaRef ds:uri="http://schemas.openxmlformats.org/officeDocument/2006/bibliography"/>
+  </ds:schemaRefs>
+</ds:datastoreItem>
+</file>
+
+<file path=customXml/itemProps4.xml><?xml version="1.0" encoding="utf-8"?>
 <ds:datastoreItem xmlns:ds="http://schemas.openxmlformats.org/officeDocument/2006/customXml" ds:itemID="{6830A3BC-7801-49DF-97A3-727FA35DA724}">
   <ds:schemaRefs>
     <ds:schemaRef ds:uri="http://schemas.microsoft.com/sharepoint/v3/contenttype/forms"/>
   </ds:schemaRefs>
 </ds:datastoreItem>
-</file>
-
-<file path=customXml/itemProps4.xml><?xml version="1.0" encoding="utf-8"?>
-<ds:datastoreItem xmlns:ds="http://schemas.openxmlformats.org/officeDocument/2006/customXml" ds:itemID="{1F2F4FAC-1BAA-4C15-8BEC-869F6AC26C67}">
-  <ds:schemaRefs>
-    <ds:schemaRef ds:uri="http://schemas.openxmlformats.org/officeDocument/2006/bibliography"/>
-  </ds:schemaRefs>
-</ds:datastoreItem>
 </file>
</xml_diff>